<commit_message>
SPIRANCA-GO on the variable-density section: 20 aquifers, re-anchoring, Section 7 of the note
- sv_model.py / sv_run.py: the MONTIMI-GO goal-guided section run season by
  season with recharge-scaled inflow, a hidden private abstraction and seasonal
  pumping; anchors with 2/8/20-year filters; decision u=+0.3 for 30 years.
- Static certificate holds under the worst warming (18 of 20 aquifers) but fails
  after the decision alone in 9 of 20 (26% over-prediction).
- Re-anchoring with one chloride sample a year keeps 3.1-3.4% in all scenarios
  (Proposition S5: the drift becomes a lag error bounded by rho(K+1)/2).
- sg_figs.py section: Figure S4; README and run_all.sh updated.
- Note rebuilt: 15 pages, new Section 7.

Co-Authored-By: Claude Opus 5.5 <noreply@anthropic.com>
Claude-Session: https://claude.ai/code/session_016Cdcj2FTAQGBVsJUyYJR2M
</commit_message>
<xml_diff>
--- a/docs/research_notes/Twenty_Chloride_Papers_and_Anchor_Regression_SPIRANCA-GO.docx
+++ b/docs/research_notes/Twenty_Chloride_Papers_and_Anchor_Regression_SPIRANCA-GO.docx
@@ -87,7 +87,7 @@
         <w:t xml:space="preserve">Abstract. </w:t>
       </w:r>
       <w:r>
-        <w:t xml:space="preserve">This note reads two documents for the Fushë-Kuqe chloride work: the note of 19 October 2026 on twenty papers from Oxford, ETH Zürich, Berkeley, Harvard and Princeton, with its three proposals N1–N3, and the anchor-regression paper of Rothenhäusler, Meinshausen, Bühlmann and Peters (2021). The twenty-paper note is sound. The proofs of N1–N3 hold and so do numerical checks, with two refinements: the slope of N1 cannot tell a target outside the model's reach from one inside it at the effective sample sizes available (a true 4 is fitted as 3.5), while its intercept is accurate; and the analytic upper bound of N3 is 5–20 times looser than the information it bounds. Applied to the safe yields of the assembled-system note, the certified threshold of N2 costs 11.6% of the value with 25 draws and cannot be issued at δ = 5%. The innovation, SPIRANCA-GO, turns anchor regression into a chloride alarm that stays valid after the pumping decision. The recorded pumping and rainfall are the anchors; the decision is a known shift outside the record, which is corrected; a warming that the rain gauge does not see is an unknown one-sided shift in the span of the anchors, which is certified; and the goal is the exceedance of 250 mg/L, not a mean-square error. On 100 aquifers drawn from the prior of the chloride study, heads-only proxies over-predict in 91% of the future seasons, least squares on heads and anchors in 36% under the worst warming, and SPIRANCA-GO in 2.4%, against the 10% allowed, with a margin 32% smaller than the same certificate added to least squares. Choosing the three piezometers by the certified margin picks the inland well A13 in 94 of the 100 aquifers and cuts the margin by 26% against the design of largest record R².</w:t>
+        <w:t xml:space="preserve">This note reads two documents for the Fushë-Kuqe chloride work: the note of 19 October 2026 on twenty papers from Oxford, ETH Zürich, Berkeley, Harvard and Princeton, with its three proposals N1–N3, and the anchor-regression paper of Rothenhäusler, Meinshausen, Bühlmann and Peters (2021). The twenty-paper note is sound. The proofs of N1–N3 hold and so do numerical checks, with two refinements: the slope of N1 cannot tell a target outside the model's reach from one inside it at the effective sample sizes available (a true 4 is fitted as 3.5), while its intercept is accurate; and the analytic upper bound of N3 is 5–20 times looser than the information it bounds. Applied to the safe yields of the assembled-system note, the certified threshold of N2 costs 11.6% of the value with 25 draws and cannot be issued at δ = 5%. The innovation, SPIRANCA-GO, turns anchor regression into a chloride alarm that stays valid after the pumping decision. The recorded pumping and rainfall are the anchors; the decision is a known shift outside the record, which is corrected; a warming that the rain gauge does not see is an unknown one-sided shift in the span of the anchors, which is certified; and the goal is the exceedance of 250 mg/L, not a mean-square error. On 100 aquifers drawn from the prior of the chloride study, heads-only proxies over-predict in 91% of the future seasons, least squares on heads and anchors in 36% under the worst warming, and SPIRANCA-GO in 2.4%, against the 10% allowed, with a margin 32% smaller than the same certificate added to least squares. Choosing the three piezometers by the certified margin picks the inland well A13 in 94 of the 100 aquifers and cuts the margin by 26% against the design of largest record R². On the variable-density section of the assembled-system note, where the interface has memory and the heads are nonlinear, the certificate still covered the unrecorded warming in 18 of 20 aquifers. After the decision alone it failed in 9, where the decision moved the screen into a regime the record had not seen. Re-anchored by one chloride sample a year at the supply screen, the alarm over-predicted in 3.4% of the seasons, with fewer false alarms than any other safe alarm.</w:t>
       </w:r>
     </w:p>
     <w:p>
@@ -110,7 +110,7 @@
           <w:sz w:val="18"/>
           <w:szCs w:val="18"/>
         </w:rPr>
-        <w:t xml:space="preserve">seawater intrusion; chloride; anchor regression; distribution shift; conformal prediction; certified alarm; monitoring design; Learn then Test; approximate Bayesian computation; expected information gain; Fushë-Kuqe</w:t>
+        <w:t xml:space="preserve">seawater intrusion; chloride; anchor regression; variable-density flow; memory; distribution shift; conformal prediction; certified alarm; monitoring design; Learn then Test; approximate Bayesian computation; expected information gain; Fushë-Kuqe</w:t>
       </w:r>
     </w:p>
     <w:p>
@@ -300,6 +300,27 @@
       </w:r>
       <w:r>
         <w:t xml:space="preserve"> Choosing three of the sixteen sector wells by the certified margin picks the inland well A13 in 94 of the 100 aquifers; the three wells nearest the supply well give margins 3.4 times larger and 22% false alarms.</w:t>
+      </w:r>
+    </w:p>
+    <w:p>
+      <w:pPr>
+        <w:pStyle w:val="ListParagraph"/>
+        <w:numPr>
+          <w:ilvl w:val="0"/>
+          <w:numId w:val="2"/>
+        </w:numPr>
+        <w:spacing w:after="50"/>
+        <w:jc w:val="both"/>
+      </w:pPr>
+      <w:r>
+        <w:rPr>
+          <w:b/>
+          <w:bCs/>
+        </w:rPr>
+        <w:t xml:space="preserve">On the variable-density section, the alarm needs one chloride sample a year.</w:t>
+      </w:r>
+      <w:r>
+        <w:t xml:space="preserve"> With memory and nonlinear heads, the certificate alone failed after the decision in 9 of 20 aquifers (it held under the warming). Re-anchored by a yearly sample at the supply screen it held in 19 of 20 (3.4%), and re-anchoring without the certificate did not (24.7%). See Section 7.</w:t>
       </w:r>
     </w:p>
     <w:p>
@@ -891,7 +912,7 @@
                 <w:sz w:val="16"/>
                 <w:szCs w:val="16"/>
               </w:rPr>
-              <w:t xml:space="preserve">The other nineteen papers</w:t>
+              <w:t xml:space="preserve">SPIRANCA-GO on the variable-density section</w:t>
             </w:r>
           </w:p>
         </w:tc>
@@ -912,7 +933,7 @@
                 <w:sz w:val="16"/>
                 <w:szCs w:val="16"/>
               </w:rPr>
-              <w:t xml:space="preserve">as listed in the note</w:t>
+              <w:t xml:space="preserve">tested on 20 aquifers</w:t>
             </w:r>
           </w:p>
         </w:tc>
@@ -933,6 +954,98 @@
                 <w:sz w:val="16"/>
                 <w:szCs w:val="16"/>
               </w:rPr>
+              <w:t xml:space="preserve">re-anchor the alarm with one chloride sample a year at each supply screen</w:t>
+            </w:r>
+          </w:p>
+        </w:tc>
+        <w:tc>
+          <w:tcPr>
+            <w:tcW w:type="dxa" w:w="1100"/>
+            <w:tcMar>
+              <w:top w:type="dxa" w:w="40"/>
+              <w:left w:type="dxa" w:w="80"/>
+              <w:bottom w:type="dxa" w:w="40"/>
+              <w:right w:type="dxa" w:w="80"/>
+            </w:tcMar>
+            <w:vAlign w:val="top"/>
+          </w:tcPr>
+          <w:p>
+            <w:r>
+              <w:rPr>
+                <w:sz w:val="16"/>
+                <w:szCs w:val="16"/>
+              </w:rPr>
+              <w:t xml:space="preserve">7</w:t>
+            </w:r>
+          </w:p>
+        </w:tc>
+      </w:tr>
+      <w:tr>
+        <w:trPr>
+          <w:cantSplit/>
+        </w:trPr>
+        <w:tc>
+          <w:tcPr>
+            <w:tcW w:type="dxa" w:w="2500"/>
+            <w:shd w:fill="F7F9FC" w:color="auto" w:val="clear"/>
+            <w:tcMar>
+              <w:top w:type="dxa" w:w="40"/>
+              <w:left w:type="dxa" w:w="80"/>
+              <w:bottom w:type="dxa" w:w="40"/>
+              <w:right w:type="dxa" w:w="80"/>
+            </w:tcMar>
+            <w:vAlign w:val="top"/>
+          </w:tcPr>
+          <w:p>
+            <w:r>
+              <w:rPr>
+                <w:sz w:val="16"/>
+                <w:szCs w:val="16"/>
+              </w:rPr>
+              <w:t xml:space="preserve">The other nineteen papers</w:t>
+            </w:r>
+          </w:p>
+        </w:tc>
+        <w:tc>
+          <w:tcPr>
+            <w:tcW w:type="dxa" w:w="1900"/>
+            <w:shd w:fill="F7F9FC" w:color="auto" w:val="clear"/>
+            <w:tcMar>
+              <w:top w:type="dxa" w:w="40"/>
+              <w:left w:type="dxa" w:w="80"/>
+              <w:bottom w:type="dxa" w:w="40"/>
+              <w:right w:type="dxa" w:w="80"/>
+            </w:tcMar>
+            <w:vAlign w:val="top"/>
+          </w:tcPr>
+          <w:p>
+            <w:r>
+              <w:rPr>
+                <w:sz w:val="16"/>
+                <w:szCs w:val="16"/>
+              </w:rPr>
+              <w:t xml:space="preserve">as listed in the note</w:t>
+            </w:r>
+          </w:p>
+        </w:tc>
+        <w:tc>
+          <w:tcPr>
+            <w:tcW w:type="dxa" w:w="4138"/>
+            <w:shd w:fill="F7F9FC" w:color="auto" w:val="clear"/>
+            <w:tcMar>
+              <w:top w:type="dxa" w:w="40"/>
+              <w:left w:type="dxa" w:w="80"/>
+              <w:bottom w:type="dxa" w:w="40"/>
+              <w:right w:type="dxa" w:w="80"/>
+            </w:tcMar>
+            <w:vAlign w:val="top"/>
+          </w:tcPr>
+          <w:p>
+            <w:r>
+              <w:rPr>
+                <w:sz w:val="16"/>
+                <w:szCs w:val="16"/>
+              </w:rPr>
               <w:t xml:space="preserve">one concrete use each (Table 2)</w:t>
             </w:r>
           </w:p>
@@ -940,6 +1053,7 @@
         <w:tc>
           <w:tcPr>
             <w:tcW w:type="dxa" w:w="1100"/>
+            <w:shd w:fill="F7F9FC" w:color="auto" w:val="clear"/>
             <w:tcMar>
               <w:top w:type="dxa" w:w="40"/>
               <w:left w:type="dxa" w:w="80"/>
@@ -7738,7 +7852,7 @@
         <w:t xml:space="preserve">goal</w:t>
       </w:r>
       <w:r>
-        <w:t xml:space="preserve"> (an exceedance, not a mean-square error). It chooses the head weights that minimise the certified margin of the alarm, and it chooses the piezometers the same way. Proposition S1 gives the law of the alarm's error after the decision from data recorded before it; Theorem S2 certifies the alarm; Proposition S3 gives the weights in closed form; Proposition S4 says which piezometers can make the alarm shift-proof. On 100 aquifers of the chloride study's model the alarm kept its error rate at 2.4% under the worst warming, where least squares on heads and anchors reached 36.0%.</w:t>
+        <w:t xml:space="preserve"> (an exceedance, not a mean-square error). It chooses the head weights that minimise the certified margin of the alarm, and it chooses the piezometers the same way. Proposition S1 gives the law of the alarm's error after the decision from data recorded before it; Theorem S2 certifies the alarm; Proposition S3 gives the weights in closed form; Proposition S4 says which piezometers can make the alarm shift-proof. On 100 aquifers of the chloride study's model the alarm kept its error rate at 2.4% under the worst warming, where least squares on heads and anchors reached 36.0%. On the variable-density section of the assembled-system note, where the interface has memory, the certificate alone was not enough after the decision. Re-anchored by one chloride sample a year at the supply screen (Proposition S5), the alarm kept its rate at 3.4%.</w:t>
       </w:r>
     </w:p>
     <w:p>
@@ -8560,16 +8674,16 @@
           </m:rPr>
           <m:t>≤</m:t>
         </m:r>
-        <m:acc>
-          <m:accPr>
-            <m:chr m:val="‾"/>
-          </m:accPr>
+        <m:bar>
+          <m:barPr>
+            <m:pos m:val="top"/>
+          </m:barPr>
           <m:e>
             <m:r>
               <m:t>δ</m:t>
             </m:r>
           </m:e>
-        </m:acc>
+        </m:bar>
       </m:oMath>
       <w:r>
         <w:t xml:space="preserve">, the direction in which a dry year moves recharge and private abstraction, with a size set by the planning scenario. The alarm predicts </w:t>
@@ -10153,16 +10267,16 @@
           </m:rPr>
           <m:t>+</m:t>
         </m:r>
-        <m:acc>
-          <m:accPr>
-            <m:chr m:val="‾"/>
-          </m:accPr>
+        <m:bar>
+          <m:barPr>
+            <m:pos m:val="top"/>
+          </m:barPr>
           <m:e>
             <m:r>
               <m:t>δ</m:t>
             </m:r>
           </m:e>
-        </m:acc>
+        </m:bar>
         <m:r>
           <m:rPr>
             <m:sty m:val="p"/>
@@ -10240,16 +10354,16 @@
               </m:rPr>
               <m:t>,</m:t>
             </m:r>
-            <m:acc>
-              <m:accPr>
-                <m:chr m:val="‾"/>
-              </m:accPr>
+            <m:bar>
+              <m:barPr>
+                <m:pos m:val="top"/>
+              </m:barPr>
               <m:e>
                 <m:r>
                   <m:t>δ</m:t>
                 </m:r>
               </m:e>
-            </m:acc>
+            </m:bar>
           </m:e>
         </m:d>
       </m:oMath>
@@ -10608,16 +10722,16 @@
           </m:rPr>
           <m:t>+</m:t>
         </m:r>
-        <m:acc>
-          <m:accPr>
-            <m:chr m:val="‾"/>
-          </m:accPr>
+        <m:bar>
+          <m:barPr>
+            <m:pos m:val="top"/>
+          </m:barPr>
           <m:e>
             <m:r>
               <m:t>δ</m:t>
             </m:r>
           </m:e>
-        </m:acc>
+        </m:bar>
         <m:r>
           <m:rPr>
             <m:sty m:val="p"/>
@@ -10906,16 +11020,16 @@
           </m:rPr>
           <m:t>=</m:t>
         </m:r>
-        <m:acc>
-          <m:accPr>
-            <m:chr m:val="‾"/>
-          </m:accPr>
+        <m:bar>
+          <m:barPr>
+            <m:pos m:val="top"/>
+          </m:barPr>
           <m:e>
             <m:r>
               <m:t>δ</m:t>
             </m:r>
           </m:e>
-        </m:acc>
+        </m:bar>
       </m:oMath>
       <w:r>
         <w:t xml:space="preserve"> if </w:t>
@@ -11058,16 +11172,16 @@
         </m:r>
         <m:sSup>
           <m:e>
-            <m:acc>
-              <m:accPr>
-                <m:chr m:val="‾"/>
-              </m:accPr>
+            <m:bar>
+              <m:barPr>
+                <m:pos m:val="top"/>
+              </m:barPr>
               <m:e>
                 <m:r>
                   <m:t>δ</m:t>
                 </m:r>
               </m:e>
-            </m:acc>
+            </m:bar>
           </m:e>
           <m:sup>
             <m:r>
@@ -11391,16 +11505,16 @@
                   </m:rPr>
                   <m:t>+</m:t>
                 </m:r>
-                <m:acc>
-                  <m:accPr>
-                    <m:chr m:val="‾"/>
-                  </m:accPr>
+                <m:bar>
+                  <m:barPr>
+                    <m:pos m:val="top"/>
+                  </m:barPr>
                   <m:e>
                     <m:r>
                       <m:t>δ</m:t>
                     </m:r>
                   </m:e>
-                </m:acc>
+                </m:bar>
                 <m:r>
                   <m:rPr>
                     <m:sty m:val="p"/>
@@ -12383,16 +12497,16 @@
           </m:rPr>
           <m:t>=</m:t>
         </m:r>
-        <m:acc>
-          <m:accPr>
-            <m:chr m:val="‾"/>
-          </m:accPr>
+        <m:bar>
+          <m:barPr>
+            <m:pos m:val="top"/>
+          </m:barPr>
           <m:e>
             <m:r>
               <m:t>δ</m:t>
             </m:r>
           </m:e>
-        </m:acc>
+        </m:bar>
         <m:d>
           <m:dPr>
             <m:begChr m:val="|"/>
@@ -12471,16 +12585,16 @@
                 </m:r>
                 <m:sSup>
                   <m:e>
-                    <m:acc>
-                      <m:accPr>
-                        <m:chr m:val="‾"/>
-                      </m:accPr>
+                    <m:bar>
+                      <m:barPr>
+                        <m:pos m:val="top"/>
+                      </m:barPr>
                       <m:e>
                         <m:r>
                           <m:t>δ</m:t>
                         </m:r>
                       </m:e>
-                    </m:acc>
+                    </m:bar>
                   </m:e>
                   <m:sup>
                     <m:r>
@@ -12533,16 +12647,16 @@
         <w:t xml:space="preserve"> if </w:t>
       </w:r>
       <m:oMath>
-        <m:acc>
-          <m:accPr>
-            <m:chr m:val="‾"/>
-          </m:accPr>
+        <m:bar>
+          <m:barPr>
+            <m:pos m:val="top"/>
+          </m:barPr>
           <m:e>
             <m:r>
               <m:t>δ</m:t>
             </m:r>
           </m:e>
-        </m:acc>
+        </m:bar>
         <m:d>
           <m:dPr>
             <m:begChr m:val="|"/>
@@ -12865,16 +12979,16 @@
           </m:rPr>
           <m:t>+</m:t>
         </m:r>
-        <m:acc>
-          <m:accPr>
-            <m:chr m:val="‾"/>
-          </m:accPr>
+        <m:bar>
+          <m:barPr>
+            <m:pos m:val="top"/>
+          </m:barPr>
           <m:e>
             <m:r>
               <m:t>δ</m:t>
             </m:r>
           </m:e>
-        </m:acc>
+        </m:bar>
         <m:r>
           <m:rPr>
             <m:sty m:val="p"/>
@@ -13004,16 +13118,16 @@
         <w:t xml:space="preserve">The two ends are familiar. With </w:t>
       </w:r>
       <m:oMath>
-        <m:acc>
-          <m:accPr>
-            <m:chr m:val="‾"/>
-          </m:accPr>
+        <m:bar>
+          <m:barPr>
+            <m:pos m:val="top"/>
+          </m:barPr>
           <m:e>
             <m:r>
               <m:t>δ</m:t>
             </m:r>
           </m:e>
-        </m:acc>
+        </m:bar>
         <m:r>
           <m:rPr>
             <m:sty m:val="p"/>
@@ -16453,7 +16567,7 @@
         </m:r>
       </m:oMath>
       <w:r>
-        <w:t xml:space="preserve">; the propositions hold unchanged for any linear functional of the anchor history. The heads were converted to potential exactly, so the structural model is linear by construction; real heads are a nonlinear function of the potential near the interface, and a test on the variable-density section of the assembled-system note is the next step. The warming was placed in the span of the rainfall anchor by assumption; the off-span stress shows what happens when it is not. The aquifers come from one prior and one sector; the 16 candidate wells are the K-wells of the survey, not a designed network.</w:t>
+        <w:t xml:space="preserve">; the propositions hold unchanged for any linear functional of the anchor history. The heads were converted to potential exactly, so the structural model is linear by construction; real heads are a nonlinear function of the potential near the interface. Section 7 repeats the test on the variable-density section of the assembled-system note, where both limits are lifted. The warming was placed in the span of the rainfall anchor by assumption; the off-span stress shows what happens when it is not. The aquifers come from one prior and one sector; the 16 candidate wells are the K-wells of the survey, not a designed network.</w:t>
       </w:r>
     </w:p>
     <w:p>
@@ -16461,7 +16575,3280 @@
         <w:pStyle w:val="Heading1"/>
       </w:pPr>
       <w:r>
-        <w:t xml:space="preserve">7. What to do next</w:t>
+        <w:t xml:space="preserve">7. The test on the variable-density section</w:t>
+      </w:r>
+    </w:p>
+    <w:p>
+      <w:pPr>
+        <w:spacing w:after="100"/>
+        <w:jc w:val="both"/>
+      </w:pPr>
+      <w:r>
+        <w:t xml:space="preserve">The areal model of Section 6 is steady and linear in its sources, which is the setting in which Propositions S1–S4 are exact. A coastal aquifer is neither: the interface lags the heads by years, the immobile zones of the silt and clay add memory, and buoyancy makes the heads a nonlinear function of the forcing. The test was therefore repeated on the vertical section of the assembled-system note [3], in the goal-guided assembly chosen there by MONTIMI-GO: variable-density flow with buoyancy and salt with two immobile zones, solved as one block by Newton's method on the goal-graded mesh (39 columns by 20 layers), with half-year steps. The section was run season by season, with three additions that do not change its equations: the inland fresh inflow is scaled each season by that season's recharge, a hidden private abstraction is spread over the top 20 m between 0.8 and 2.2 km from the coast, and the supply well at 2 km is pumped at a different rate each season. Table 7 lists the setting.</w:t>
+      </w:r>
+    </w:p>
+    <w:p>
+      <w:pPr>
+        <w:keepNext/>
+        <w:spacing w:after="60" w:before="120"/>
+        <w:jc w:val="both"/>
+      </w:pPr>
+      <w:r>
+        <w:rPr>
+          <w:b/>
+          <w:bCs/>
+          <w:color w:val="1F3864"/>
+          <w:sz w:val="18"/>
+          <w:szCs w:val="18"/>
+        </w:rPr>
+        <w:t xml:space="preserve">Table 7. </w:t>
+      </w:r>
+      <w:r>
+        <w:rPr>
+          <w:color w:val="3A4350"/>
+          <w:sz w:val="18"/>
+          <w:szCs w:val="18"/>
+        </w:rPr>
+        <w:t xml:space="preserve">The test on the variable-density section (code: experiments/spiranca_go, sv_model.py and sv_run.py; 20 aquifers in ten minutes on four cores).</w:t>
+      </w:r>
+    </w:p>
+    <w:tbl>
+      <w:tblPr>
+        <w:tblW w:type="dxa" w:w="9638"/>
+        <w:tblBorders>
+          <w:top w:val="single" w:color="C9D1DC" w:sz="4"/>
+          <w:left w:val="none" w:color="FFFFFF" w:sz="0"/>
+          <w:bottom w:val="single" w:color="C9D1DC" w:sz="4"/>
+          <w:right w:val="none" w:color="FFFFFF" w:sz="0"/>
+          <w:insideH w:val="single" w:color="E3E8EF" w:sz="4"/>
+          <w:insideV w:val="none" w:color="FFFFFF" w:sz="0"/>
+        </w:tblBorders>
+        <w:tblLayout w:type="fixed"/>
+      </w:tblPr>
+      <w:tblGrid>
+        <w:gridCol w:w="2400"/>
+        <w:gridCol w:w="7238"/>
+      </w:tblGrid>
+      <w:tr>
+        <w:trPr>
+          <w:cantSplit/>
+          <w:tblHeader/>
+        </w:trPr>
+        <w:tc>
+          <w:tcPr>
+            <w:tcW w:type="dxa" w:w="2400"/>
+            <w:shd w:fill="1F3864" w:color="auto" w:val="clear"/>
+            <w:tcMar>
+              <w:top w:type="dxa" w:w="40"/>
+              <w:left w:type="dxa" w:w="80"/>
+              <w:bottom w:type="dxa" w:w="40"/>
+              <w:right w:type="dxa" w:w="80"/>
+            </w:tcMar>
+            <w:vAlign w:val="top"/>
+          </w:tcPr>
+          <w:p>
+            <w:r>
+              <w:rPr>
+                <w:rFonts w:ascii="Calibri" w:cs="Calibri" w:eastAsia="Calibri" w:hAnsi="Calibri"/>
+                <w:b/>
+                <w:bCs/>
+                <w:color w:val="FFFFFF"/>
+                <w:sz w:val="16"/>
+                <w:szCs w:val="16"/>
+              </w:rPr>
+              <w:t xml:space="preserve">Item</w:t>
+            </w:r>
+          </w:p>
+        </w:tc>
+        <w:tc>
+          <w:tcPr>
+            <w:tcW w:type="dxa" w:w="7238"/>
+            <w:shd w:fill="1F3864" w:color="auto" w:val="clear"/>
+            <w:tcMar>
+              <w:top w:type="dxa" w:w="40"/>
+              <w:left w:type="dxa" w:w="80"/>
+              <w:bottom w:type="dxa" w:w="40"/>
+              <w:right w:type="dxa" w:w="80"/>
+            </w:tcMar>
+            <w:vAlign w:val="top"/>
+          </w:tcPr>
+          <w:p>
+            <w:r>
+              <w:rPr>
+                <w:rFonts w:ascii="Calibri" w:cs="Calibri" w:eastAsia="Calibri" w:hAnsi="Calibri"/>
+                <w:b/>
+                <w:bCs/>
+                <w:color w:val="FFFFFF"/>
+                <w:sz w:val="16"/>
+                <w:szCs w:val="16"/>
+              </w:rPr>
+              <w:t xml:space="preserve">Choice</w:t>
+            </w:r>
+          </w:p>
+        </w:tc>
+      </w:tr>
+      <w:tr>
+        <w:trPr>
+          <w:cantSplit/>
+        </w:trPr>
+        <w:tc>
+          <w:tcPr>
+            <w:tcW w:type="dxa" w:w="2400"/>
+            <w:tcMar>
+              <w:top w:type="dxa" w:w="40"/>
+              <w:left w:type="dxa" w:w="80"/>
+              <w:bottom w:type="dxa" w:w="40"/>
+              <w:right w:type="dxa" w:w="80"/>
+            </w:tcMar>
+            <w:vAlign w:val="top"/>
+          </w:tcPr>
+          <w:p>
+            <w:r>
+              <w:rPr>
+                <w:sz w:val="16"/>
+                <w:szCs w:val="16"/>
+              </w:rPr>
+              <w:t xml:space="preserve">Aquifers</w:t>
+            </w:r>
+          </w:p>
+        </w:tc>
+        <w:tc>
+          <w:tcPr>
+            <w:tcW w:type="dxa" w:w="7238"/>
+            <w:tcMar>
+              <w:top w:type="dxa" w:w="40"/>
+              <w:left w:type="dxa" w:w="80"/>
+              <w:bottom w:type="dxa" w:w="40"/>
+              <w:right w:type="dxa" w:w="80"/>
+            </w:tcMar>
+            <w:vAlign w:val="top"/>
+          </w:tcPr>
+          <w:p>
+            <w:r>
+              <w:rPr>
+                <w:sz w:val="16"/>
+                <w:szCs w:val="16"/>
+              </w:rPr>
+              <w:t xml:space="preserve">20 parameter draws of the assembled-system note (conductivity, regional inflow, dispersivity, slow immobile capacity); each takes about two minutes</w:t>
+            </w:r>
+          </w:p>
+        </w:tc>
+      </w:tr>
+      <w:tr>
+        <w:trPr>
+          <w:cantSplit/>
+        </w:trPr>
+        <w:tc>
+          <w:tcPr>
+            <w:tcW w:type="dxa" w:w="2400"/>
+            <w:shd w:fill="F7F9FC" w:color="auto" w:val="clear"/>
+            <w:tcMar>
+              <w:top w:type="dxa" w:w="40"/>
+              <w:left w:type="dxa" w:w="80"/>
+              <w:bottom w:type="dxa" w:w="40"/>
+              <w:right w:type="dxa" w:w="80"/>
+            </w:tcMar>
+            <w:vAlign w:val="top"/>
+          </w:tcPr>
+          <w:p>
+            <w:r>
+              <w:rPr>
+                <w:sz w:val="16"/>
+                <w:szCs w:val="16"/>
+              </w:rPr>
+              <w:t xml:space="preserve">Before the record</w:t>
+            </w:r>
+          </w:p>
+        </w:tc>
+        <w:tc>
+          <w:tcPr>
+            <w:tcW w:type="dxa" w:w="7238"/>
+            <w:shd w:fill="F7F9FC" w:color="auto" w:val="clear"/>
+            <w:tcMar>
+              <w:top w:type="dxa" w:w="40"/>
+              <w:left w:type="dxa" w:w="80"/>
+              <w:bottom w:type="dxa" w:w="40"/>
+              <w:right w:type="dxa" w:w="80"/>
+            </w:tcMar>
+            <w:vAlign w:val="top"/>
+          </w:tcPr>
+          <w:p>
+            <w:r>
+              <w:rPr>
+                <w:sz w:val="16"/>
+                <w:szCs w:val="16"/>
+              </w:rPr>
+              <w:t xml:space="preserve">100 years of the private abstraction alone (0.3 of the regional inflow), from the pre-development equilibrium</w:t>
+            </w:r>
+          </w:p>
+        </w:tc>
+      </w:tr>
+      <w:tr>
+        <w:trPr>
+          <w:cantSplit/>
+        </w:trPr>
+        <w:tc>
+          <w:tcPr>
+            <w:tcW w:type="dxa" w:w="2400"/>
+            <w:tcMar>
+              <w:top w:type="dxa" w:w="40"/>
+              <w:left w:type="dxa" w:w="80"/>
+              <w:bottom w:type="dxa" w:w="40"/>
+              <w:right w:type="dxa" w:w="80"/>
+            </w:tcMar>
+            <w:vAlign w:val="top"/>
+          </w:tcPr>
+          <w:p>
+            <w:r>
+              <w:rPr>
+                <w:sz w:val="16"/>
+                <w:szCs w:val="16"/>
+              </w:rPr>
+              <w:t xml:space="preserve">Record</w:t>
+            </w:r>
+          </w:p>
+        </w:tc>
+        <w:tc>
+          <w:tcPr>
+            <w:tcW w:type="dxa" w:w="7238"/>
+            <w:tcMar>
+              <w:top w:type="dxa" w:w="40"/>
+              <w:left w:type="dxa" w:w="80"/>
+              <w:bottom w:type="dxa" w:w="40"/>
+              <w:right w:type="dxa" w:w="80"/>
+            </w:tcMar>
+            <w:vAlign w:val="top"/>
+          </w:tcPr>
+          <w:p>
+            <w:r>
+              <w:rPr>
+                <w:sz w:val="16"/>
+                <w:szCs w:val="16"/>
+              </w:rPr>
+              <w:t xml:space="preserve">80 years in half-year seasons: the utility pumping ramps up over the first 10 years and then varies by season; the first 30 years are discarded, seasons 61–130 fit the alarm and 131–160 calibrate its margin</w:t>
+            </w:r>
+          </w:p>
+        </w:tc>
+      </w:tr>
+      <w:tr>
+        <w:trPr>
+          <w:cantSplit/>
+        </w:trPr>
+        <w:tc>
+          <w:tcPr>
+            <w:tcW w:type="dxa" w:w="2400"/>
+            <w:shd w:fill="F7F9FC" w:color="auto" w:val="clear"/>
+            <w:tcMar>
+              <w:top w:type="dxa" w:w="40"/>
+              <w:left w:type="dxa" w:w="80"/>
+              <w:bottom w:type="dxa" w:w="40"/>
+              <w:right w:type="dxa" w:w="80"/>
+            </w:tcMar>
+            <w:vAlign w:val="top"/>
+          </w:tcPr>
+          <w:p>
+            <w:r>
+              <w:rPr>
+                <w:sz w:val="16"/>
+                <w:szCs w:val="16"/>
+              </w:rPr>
+              <w:t xml:space="preserve">Anchors (recorded)</w:t>
+            </w:r>
+          </w:p>
+        </w:tc>
+        <w:tc>
+          <w:tcPr>
+            <w:tcW w:type="dxa" w:w="7238"/>
+            <w:shd w:fill="F7F9FC" w:color="auto" w:val="clear"/>
+            <w:tcMar>
+              <w:top w:type="dxa" w:w="40"/>
+              <w:left w:type="dxa" w:w="80"/>
+              <w:bottom w:type="dxa" w:w="40"/>
+              <w:right w:type="dxa" w:w="80"/>
+            </w:tcMar>
+            <w:vAlign w:val="top"/>
+          </w:tcPr>
+          <w:p>
+            <w:r>
+              <w:rPr>
+                <w:sz w:val="16"/>
+                <w:szCs w:val="16"/>
+              </w:rPr>
+              <w:t xml:space="preserve">rainfall anomaly r, persistent from season to season (lag-one correlation 0.7, so droughts last years), and the utility's pumping anomaly; each also filtered over 2, 8, 20 years, because the interface responds to the history of the forcing</w:t>
+            </w:r>
+          </w:p>
+        </w:tc>
+      </w:tr>
+      <w:tr>
+        <w:trPr>
+          <w:cantSplit/>
+        </w:trPr>
+        <w:tc>
+          <w:tcPr>
+            <w:tcW w:type="dxa" w:w="2400"/>
+            <w:tcMar>
+              <w:top w:type="dxa" w:w="40"/>
+              <w:left w:type="dxa" w:w="80"/>
+              <w:bottom w:type="dxa" w:w="40"/>
+              <w:right w:type="dxa" w:w="80"/>
+            </w:tcMar>
+            <w:vAlign w:val="top"/>
+          </w:tcPr>
+          <w:p>
+            <w:r>
+              <w:rPr>
+                <w:sz w:val="16"/>
+                <w:szCs w:val="16"/>
+              </w:rPr>
+              <w:t xml:space="preserve">Hidden</w:t>
+            </w:r>
+          </w:p>
+        </w:tc>
+        <w:tc>
+          <w:tcPr>
+            <w:tcW w:type="dxa" w:w="7238"/>
+            <w:tcMar>
+              <w:top w:type="dxa" w:w="40"/>
+              <w:left w:type="dxa" w:w="80"/>
+              <w:bottom w:type="dxa" w:w="40"/>
+              <w:right w:type="dxa" w:w="80"/>
+            </w:tcMar>
+            <w:vAlign w:val="top"/>
+          </w:tcPr>
+          <w:p>
+            <w:r>
+              <w:rPr>
+                <w:sz w:val="16"/>
+                <w:szCs w:val="16"/>
+              </w:rPr>
+              <w:t xml:space="preserve">inflow factor 1 + 0.2 r + 0.06 e_R; private abstraction (1 − 0.25 r + 0.15 e_H) times its mean; e_R and e_H unrecorded</w:t>
+            </w:r>
+          </w:p>
+        </w:tc>
+      </w:tr>
+      <w:tr>
+        <w:trPr>
+          <w:cantSplit/>
+        </w:trPr>
+        <w:tc>
+          <w:tcPr>
+            <w:tcW w:type="dxa" w:w="2400"/>
+            <w:shd w:fill="F7F9FC" w:color="auto" w:val="clear"/>
+            <w:tcMar>
+              <w:top w:type="dxa" w:w="40"/>
+              <w:left w:type="dxa" w:w="80"/>
+              <w:bottom w:type="dxa" w:w="40"/>
+              <w:right w:type="dxa" w:w="80"/>
+            </w:tcMar>
+            <w:vAlign w:val="top"/>
+          </w:tcPr>
+          <w:p>
+            <w:r>
+              <w:rPr>
+                <w:sz w:val="16"/>
+                <w:szCs w:val="16"/>
+              </w:rPr>
+              <w:t xml:space="preserve">Heads</w:t>
+            </w:r>
+          </w:p>
+        </w:tc>
+        <w:tc>
+          <w:tcPr>
+            <w:tcW w:type="dxa" w:w="7238"/>
+            <w:shd w:fill="F7F9FC" w:color="auto" w:val="clear"/>
+            <w:tcMar>
+              <w:top w:type="dxa" w:w="40"/>
+              <w:left w:type="dxa" w:w="80"/>
+              <w:bottom w:type="dxa" w:w="40"/>
+              <w:right w:type="dxa" w:w="80"/>
+            </w:tcMar>
+            <w:vAlign w:val="top"/>
+          </w:tcPr>
+          <w:p>
+            <w:r>
+              <w:rPr>
+                <w:sz w:val="16"/>
+                <w:szCs w:val="16"/>
+              </w:rPr>
+              <w:t xml:space="preserve">six piezometers at mid-depth, 0.5–3.5 km from the coast, 0.01 m of noise; current heads and heads filtered over 8 years</w:t>
+            </w:r>
+          </w:p>
+        </w:tc>
+      </w:tr>
+      <w:tr>
+        <w:trPr>
+          <w:cantSplit/>
+        </w:trPr>
+        <w:tc>
+          <w:tcPr>
+            <w:tcW w:type="dxa" w:w="2400"/>
+            <w:tcMar>
+              <w:top w:type="dxa" w:w="40"/>
+              <w:left w:type="dxa" w:w="80"/>
+              <w:bottom w:type="dxa" w:w="40"/>
+              <w:right w:type="dxa" w:w="80"/>
+            </w:tcMar>
+            <w:vAlign w:val="top"/>
+          </w:tcPr>
+          <w:p>
+            <w:r>
+              <w:rPr>
+                <w:sz w:val="16"/>
+                <w:szCs w:val="16"/>
+              </w:rPr>
+              <w:t xml:space="preserve">Goal</w:t>
+            </w:r>
+          </w:p>
+        </w:tc>
+        <w:tc>
+          <w:tcPr>
+            <w:tcW w:type="dxa" w:w="7238"/>
+            <w:tcMar>
+              <w:top w:type="dxa" w:w="40"/>
+              <w:left w:type="dxa" w:w="80"/>
+              <w:bottom w:type="dxa" w:w="40"/>
+              <w:right w:type="dxa" w:w="80"/>
+            </w:tcMar>
+            <w:vAlign w:val="top"/>
+          </w:tcPr>
+          <w:p>
+            <w:r>
+              <w:rPr>
+                <w:sz w:val="16"/>
+                <w:szCs w:val="16"/>
+              </w:rPr>
+              <w:t xml:space="preserve">Y = −log₁₀ of the sea fraction over the supply screen; the standard of 250 mg/L is exceeded when Y falls below −log₁₀ ε_lim</w:t>
+            </w:r>
+          </w:p>
+        </w:tc>
+      </w:tr>
+      <w:tr>
+        <w:trPr>
+          <w:cantSplit/>
+        </w:trPr>
+        <w:tc>
+          <w:tcPr>
+            <w:tcW w:type="dxa" w:w="2400"/>
+            <w:shd w:fill="F7F9FC" w:color="auto" w:val="clear"/>
+            <w:tcMar>
+              <w:top w:type="dxa" w:w="40"/>
+              <w:left w:type="dxa" w:w="80"/>
+              <w:bottom w:type="dxa" w:w="40"/>
+              <w:right w:type="dxa" w:w="80"/>
+            </w:tcMar>
+            <w:vAlign w:val="top"/>
+          </w:tcPr>
+          <w:p>
+            <w:r>
+              <w:rPr>
+                <w:sz w:val="16"/>
+                <w:szCs w:val="16"/>
+              </w:rPr>
+              <w:t xml:space="preserve">Decision (known)</w:t>
+            </w:r>
+          </w:p>
+        </w:tc>
+        <w:tc>
+          <w:tcPr>
+            <w:tcW w:type="dxa" w:w="7238"/>
+            <w:shd w:fill="F7F9FC" w:color="auto" w:val="clear"/>
+            <w:tcMar>
+              <w:top w:type="dxa" w:w="40"/>
+              <w:left w:type="dxa" w:w="80"/>
+              <w:bottom w:type="dxa" w:w="40"/>
+              <w:right w:type="dxa" w:w="80"/>
+            </w:tcMar>
+            <w:vAlign w:val="top"/>
+          </w:tcPr>
+          <w:p>
+            <w:r>
+              <w:rPr>
+                <w:sz w:val="16"/>
+                <w:szCs w:val="16"/>
+              </w:rPr>
+              <w:t xml:space="preserve">the pumping anomaly is raised to +0.3 and kept there for 30 years. The mean pumping of each aquifer (1.53–3.87 m²/d per metre of coast) is set so that, after the decision and under the first weather sequence, the screen reaches the standard after 30 years</w:t>
+            </w:r>
+          </w:p>
+        </w:tc>
+      </w:tr>
+      <w:tr>
+        <w:trPr>
+          <w:cantSplit/>
+        </w:trPr>
+        <w:tc>
+          <w:tcPr>
+            <w:tcW w:type="dxa" w:w="2400"/>
+            <w:tcMar>
+              <w:top w:type="dxa" w:w="40"/>
+              <w:left w:type="dxa" w:w="80"/>
+              <w:bottom w:type="dxa" w:w="40"/>
+              <w:right w:type="dxa" w:w="80"/>
+            </w:tcMar>
+            <w:vAlign w:val="top"/>
+          </w:tcPr>
+          <w:p>
+            <w:r>
+              <w:rPr>
+                <w:sz w:val="16"/>
+                <w:szCs w:val="16"/>
+              </w:rPr>
+              <w:t xml:space="preserve">Futures</w:t>
+            </w:r>
+          </w:p>
+        </w:tc>
+        <w:tc>
+          <w:tcPr>
+            <w:tcW w:type="dxa" w:w="7238"/>
+            <w:tcMar>
+              <w:top w:type="dxa" w:w="40"/>
+              <w:left w:type="dxa" w:w="80"/>
+              <w:bottom w:type="dxa" w:w="40"/>
+              <w:right w:type="dxa" w:w="80"/>
+            </w:tcMar>
+            <w:vAlign w:val="top"/>
+          </w:tcPr>
+          <w:p>
+            <w:r>
+              <w:rPr>
+                <w:sz w:val="16"/>
+                <w:szCs w:val="16"/>
+              </w:rPr>
+              <w:t xml:space="preserve">8 weather sequences of 30 years per scenario: no warming, the worst unrecorded warming (δ = 1), and the off-span stress. Median share of exceeding seasons: 16%, 64% and 25%</w:t>
+            </w:r>
+          </w:p>
+        </w:tc>
+      </w:tr>
+    </w:tbl>
+    <w:p>
+      <w:pPr>
+        <w:spacing w:after="120"/>
+      </w:pPr>
+    </w:p>
+    <w:p>
+      <w:pPr>
+        <w:pStyle w:val="Heading2"/>
+      </w:pPr>
+      <w:r>
+        <w:t xml:space="preserve">7.1 The certificate alone does not survive the decision</w:t>
+      </w:r>
+    </w:p>
+    <w:p>
+      <w:pPr>
+        <w:keepNext/>
+        <w:spacing w:after="60" w:before="120"/>
+        <w:jc w:val="both"/>
+      </w:pPr>
+      <w:r>
+        <w:rPr>
+          <w:b/>
+          <w:bCs/>
+          <w:color w:val="1F3864"/>
+          <w:sz w:val="18"/>
+          <w:szCs w:val="18"/>
+        </w:rPr>
+        <w:t xml:space="preserve">Table 8. </w:t>
+      </w:r>
+      <w:r>
+        <w:rPr>
+          <w:color w:val="3A4350"/>
+          <w:sz w:val="18"/>
+          <w:szCs w:val="18"/>
+        </w:rPr>
+        <w:t xml:space="preserve">Share of future seasons in which each alarm over-predicts by more than its margin, mean over 20 aquifers (in brackets: number of aquifers above 10%), with all six piezometers; false alarms among safe seasons and missed exceedances among exceeding seasons, without warming.</w:t>
+      </w:r>
+    </w:p>
+    <w:tbl>
+      <w:tblPr>
+        <w:tblW w:type="dxa" w:w="9638"/>
+        <w:tblBorders>
+          <w:top w:val="single" w:color="C9D1DC" w:sz="4"/>
+          <w:left w:val="none" w:color="FFFFFF" w:sz="0"/>
+          <w:bottom w:val="single" w:color="C9D1DC" w:sz="4"/>
+          <w:right w:val="none" w:color="FFFFFF" w:sz="0"/>
+          <w:insideH w:val="single" w:color="E3E8EF" w:sz="4"/>
+          <w:insideV w:val="none" w:color="FFFFFF" w:sz="0"/>
+        </w:tblBorders>
+        <w:tblLayout w:type="fixed"/>
+      </w:tblPr>
+      <w:tblGrid>
+        <w:gridCol w:w="3100"/>
+        <w:gridCol w:w="1150"/>
+        <w:gridCol w:w="1150"/>
+        <w:gridCol w:w="1150"/>
+        <w:gridCol w:w="1500"/>
+        <w:gridCol w:w="1588"/>
+      </w:tblGrid>
+      <w:tr>
+        <w:trPr>
+          <w:cantSplit/>
+          <w:tblHeader/>
+        </w:trPr>
+        <w:tc>
+          <w:tcPr>
+            <w:tcW w:type="dxa" w:w="3100"/>
+            <w:shd w:fill="1F3864" w:color="auto" w:val="clear"/>
+            <w:tcMar>
+              <w:top w:type="dxa" w:w="40"/>
+              <w:left w:type="dxa" w:w="80"/>
+              <w:bottom w:type="dxa" w:w="40"/>
+              <w:right w:type="dxa" w:w="80"/>
+            </w:tcMar>
+            <w:vAlign w:val="top"/>
+          </w:tcPr>
+          <w:p>
+            <w:r>
+              <w:rPr>
+                <w:rFonts w:ascii="Calibri" w:cs="Calibri" w:eastAsia="Calibri" w:hAnsi="Calibri"/>
+                <w:b/>
+                <w:bCs/>
+                <w:color w:val="FFFFFF"/>
+                <w:sz w:val="15"/>
+                <w:szCs w:val="15"/>
+              </w:rPr>
+              <w:t xml:space="preserve">Alarm</w:t>
+            </w:r>
+          </w:p>
+        </w:tc>
+        <w:tc>
+          <w:tcPr>
+            <w:tcW w:type="dxa" w:w="1150"/>
+            <w:shd w:fill="1F3864" w:color="auto" w:val="clear"/>
+            <w:tcMar>
+              <w:top w:type="dxa" w:w="40"/>
+              <w:left w:type="dxa" w:w="80"/>
+              <w:bottom w:type="dxa" w:w="40"/>
+              <w:right w:type="dxa" w:w="80"/>
+            </w:tcMar>
+            <w:vAlign w:val="top"/>
+          </w:tcPr>
+          <w:p>
+            <w:r>
+              <w:rPr>
+                <w:rFonts w:ascii="Calibri" w:cs="Calibri" w:eastAsia="Calibri" w:hAnsi="Calibri"/>
+                <w:b/>
+                <w:bCs/>
+                <w:color w:val="FFFFFF"/>
+                <w:sz w:val="15"/>
+                <w:szCs w:val="15"/>
+              </w:rPr>
+              <w:t xml:space="preserve">No warming</w:t>
+            </w:r>
+          </w:p>
+        </w:tc>
+        <w:tc>
+          <w:tcPr>
+            <w:tcW w:type="dxa" w:w="1150"/>
+            <w:shd w:fill="1F3864" w:color="auto" w:val="clear"/>
+            <w:tcMar>
+              <w:top w:type="dxa" w:w="40"/>
+              <w:left w:type="dxa" w:w="80"/>
+              <w:bottom w:type="dxa" w:w="40"/>
+              <w:right w:type="dxa" w:w="80"/>
+            </w:tcMar>
+            <w:vAlign w:val="top"/>
+          </w:tcPr>
+          <w:p>
+            <w:r>
+              <w:rPr>
+                <w:rFonts w:ascii="Calibri" w:cs="Calibri" w:eastAsia="Calibri" w:hAnsi="Calibri"/>
+                <w:b/>
+                <w:bCs/>
+                <w:color w:val="FFFFFF"/>
+                <w:sz w:val="15"/>
+                <w:szCs w:val="15"/>
+              </w:rPr>
+              <w:t xml:space="preserve">Worst warming</w:t>
+            </w:r>
+          </w:p>
+        </w:tc>
+        <w:tc>
+          <w:tcPr>
+            <w:tcW w:type="dxa" w:w="1150"/>
+            <w:shd w:fill="1F3864" w:color="auto" w:val="clear"/>
+            <w:tcMar>
+              <w:top w:type="dxa" w:w="40"/>
+              <w:left w:type="dxa" w:w="80"/>
+              <w:bottom w:type="dxa" w:w="40"/>
+              <w:right w:type="dxa" w:w="80"/>
+            </w:tcMar>
+            <w:vAlign w:val="top"/>
+          </w:tcPr>
+          <w:p>
+            <w:r>
+              <w:rPr>
+                <w:rFonts w:ascii="Calibri" w:cs="Calibri" w:eastAsia="Calibri" w:hAnsi="Calibri"/>
+                <w:b/>
+                <w:bCs/>
+                <w:color w:val="FFFFFF"/>
+                <w:sz w:val="15"/>
+                <w:szCs w:val="15"/>
+              </w:rPr>
+              <w:t xml:space="preserve">Off-span stress</w:t>
+            </w:r>
+          </w:p>
+        </w:tc>
+        <w:tc>
+          <w:tcPr>
+            <w:tcW w:type="dxa" w:w="1500"/>
+            <w:shd w:fill="1F3864" w:color="auto" w:val="clear"/>
+            <w:tcMar>
+              <w:top w:type="dxa" w:w="40"/>
+              <w:left w:type="dxa" w:w="80"/>
+              <w:bottom w:type="dxa" w:w="40"/>
+              <w:right w:type="dxa" w:w="80"/>
+            </w:tcMar>
+            <w:vAlign w:val="top"/>
+          </w:tcPr>
+          <w:p>
+            <w:r>
+              <w:rPr>
+                <w:rFonts w:ascii="Calibri" w:cs="Calibri" w:eastAsia="Calibri" w:hAnsi="Calibri"/>
+                <w:b/>
+                <w:bCs/>
+                <w:color w:val="FFFFFF"/>
+                <w:sz w:val="15"/>
+                <w:szCs w:val="15"/>
+              </w:rPr>
+              <w:t xml:space="preserve">False alarms (no warming)</w:t>
+            </w:r>
+          </w:p>
+        </w:tc>
+        <w:tc>
+          <w:tcPr>
+            <w:tcW w:type="dxa" w:w="1588"/>
+            <w:shd w:fill="1F3864" w:color="auto" w:val="clear"/>
+            <w:tcMar>
+              <w:top w:type="dxa" w:w="40"/>
+              <w:left w:type="dxa" w:w="80"/>
+              <w:bottom w:type="dxa" w:w="40"/>
+              <w:right w:type="dxa" w:w="80"/>
+            </w:tcMar>
+            <w:vAlign w:val="top"/>
+          </w:tcPr>
+          <w:p>
+            <w:r>
+              <w:rPr>
+                <w:rFonts w:ascii="Calibri" w:cs="Calibri" w:eastAsia="Calibri" w:hAnsi="Calibri"/>
+                <w:b/>
+                <w:bCs/>
+                <w:color w:val="FFFFFF"/>
+                <w:sz w:val="15"/>
+                <w:szCs w:val="15"/>
+              </w:rPr>
+              <w:t xml:space="preserve">Missed exceedances (no warming)</w:t>
+            </w:r>
+          </w:p>
+        </w:tc>
+      </w:tr>
+      <w:tr>
+        <w:trPr>
+          <w:cantSplit/>
+        </w:trPr>
+        <w:tc>
+          <w:tcPr>
+            <w:tcW w:type="dxa" w:w="3100"/>
+            <w:tcMar>
+              <w:top w:type="dxa" w:w="40"/>
+              <w:left w:type="dxa" w:w="80"/>
+              <w:bottom w:type="dxa" w:w="40"/>
+              <w:right w:type="dxa" w:w="80"/>
+            </w:tcMar>
+            <w:vAlign w:val="top"/>
+          </w:tcPr>
+          <w:p>
+            <w:r>
+              <w:rPr>
+                <w:sz w:val="15"/>
+                <w:szCs w:val="15"/>
+              </w:rPr>
+              <w:t xml:space="preserve">Least squares on the heads</w:t>
+            </w:r>
+          </w:p>
+        </w:tc>
+        <w:tc>
+          <w:tcPr>
+            <w:tcW w:type="dxa" w:w="1150"/>
+            <w:tcMar>
+              <w:top w:type="dxa" w:w="40"/>
+              <w:left w:type="dxa" w:w="80"/>
+              <w:bottom w:type="dxa" w:w="40"/>
+              <w:right w:type="dxa" w:w="80"/>
+            </w:tcMar>
+            <w:vAlign w:val="top"/>
+          </w:tcPr>
+          <w:p>
+            <w:r>
+              <w:rPr>
+                <w:sz w:val="15"/>
+                <w:szCs w:val="15"/>
+              </w:rPr>
+              <w:t xml:space="preserve">22.0% (8)</w:t>
+            </w:r>
+          </w:p>
+        </w:tc>
+        <w:tc>
+          <w:tcPr>
+            <w:tcW w:type="dxa" w:w="1150"/>
+            <w:tcMar>
+              <w:top w:type="dxa" w:w="40"/>
+              <w:left w:type="dxa" w:w="80"/>
+              <w:bottom w:type="dxa" w:w="40"/>
+              <w:right w:type="dxa" w:w="80"/>
+            </w:tcMar>
+            <w:vAlign w:val="top"/>
+          </w:tcPr>
+          <w:p>
+            <w:r>
+              <w:rPr>
+                <w:sz w:val="15"/>
+                <w:szCs w:val="15"/>
+              </w:rPr>
+              <w:t xml:space="preserve">21.2% (9)</w:t>
+            </w:r>
+          </w:p>
+        </w:tc>
+        <w:tc>
+          <w:tcPr>
+            <w:tcW w:type="dxa" w:w="1150"/>
+            <w:tcMar>
+              <w:top w:type="dxa" w:w="40"/>
+              <w:left w:type="dxa" w:w="80"/>
+              <w:bottom w:type="dxa" w:w="40"/>
+              <w:right w:type="dxa" w:w="80"/>
+            </w:tcMar>
+            <w:vAlign w:val="top"/>
+          </w:tcPr>
+          <w:p>
+            <w:r>
+              <w:rPr>
+                <w:sz w:val="15"/>
+                <w:szCs w:val="15"/>
+              </w:rPr>
+              <w:t xml:space="preserve">18.6% (6)</w:t>
+            </w:r>
+          </w:p>
+        </w:tc>
+        <w:tc>
+          <w:tcPr>
+            <w:tcW w:type="dxa" w:w="1500"/>
+            <w:tcMar>
+              <w:top w:type="dxa" w:w="40"/>
+              <w:left w:type="dxa" w:w="80"/>
+              <w:bottom w:type="dxa" w:w="40"/>
+              <w:right w:type="dxa" w:w="80"/>
+            </w:tcMar>
+            <w:vAlign w:val="top"/>
+          </w:tcPr>
+          <w:p>
+            <w:r>
+              <w:rPr>
+                <w:sz w:val="15"/>
+                <w:szCs w:val="15"/>
+              </w:rPr>
+              <w:t xml:space="preserve">38.7%</w:t>
+            </w:r>
+          </w:p>
+        </w:tc>
+        <w:tc>
+          <w:tcPr>
+            <w:tcW w:type="dxa" w:w="1588"/>
+            <w:tcMar>
+              <w:top w:type="dxa" w:w="40"/>
+              <w:left w:type="dxa" w:w="80"/>
+              <w:bottom w:type="dxa" w:w="40"/>
+              <w:right w:type="dxa" w:w="80"/>
+            </w:tcMar>
+            <w:vAlign w:val="top"/>
+          </w:tcPr>
+          <w:p>
+            <w:r>
+              <w:rPr>
+                <w:sz w:val="15"/>
+                <w:szCs w:val="15"/>
+              </w:rPr>
+              <w:t xml:space="preserve">25.6%</w:t>
+            </w:r>
+          </w:p>
+        </w:tc>
+      </w:tr>
+      <w:tr>
+        <w:trPr>
+          <w:cantSplit/>
+        </w:trPr>
+        <w:tc>
+          <w:tcPr>
+            <w:tcW w:type="dxa" w:w="3100"/>
+            <w:shd w:fill="F7F9FC" w:color="auto" w:val="clear"/>
+            <w:tcMar>
+              <w:top w:type="dxa" w:w="40"/>
+              <w:left w:type="dxa" w:w="80"/>
+              <w:bottom w:type="dxa" w:w="40"/>
+              <w:right w:type="dxa" w:w="80"/>
+            </w:tcMar>
+            <w:vAlign w:val="top"/>
+          </w:tcPr>
+          <w:p>
+            <w:r>
+              <w:rPr>
+                <w:sz w:val="15"/>
+                <w:szCs w:val="15"/>
+              </w:rPr>
+              <w:t xml:space="preserve">Anchor regression, γ by cross-validation</w:t>
+            </w:r>
+          </w:p>
+        </w:tc>
+        <w:tc>
+          <w:tcPr>
+            <w:tcW w:type="dxa" w:w="1150"/>
+            <w:shd w:fill="F7F9FC" w:color="auto" w:val="clear"/>
+            <w:tcMar>
+              <w:top w:type="dxa" w:w="40"/>
+              <w:left w:type="dxa" w:w="80"/>
+              <w:bottom w:type="dxa" w:w="40"/>
+              <w:right w:type="dxa" w:w="80"/>
+            </w:tcMar>
+            <w:vAlign w:val="top"/>
+          </w:tcPr>
+          <w:p>
+            <w:r>
+              <w:rPr>
+                <w:sz w:val="15"/>
+                <w:szCs w:val="15"/>
+              </w:rPr>
+              <w:t xml:space="preserve">23.1% (7)</w:t>
+            </w:r>
+          </w:p>
+        </w:tc>
+        <w:tc>
+          <w:tcPr>
+            <w:tcW w:type="dxa" w:w="1150"/>
+            <w:shd w:fill="F7F9FC" w:color="auto" w:val="clear"/>
+            <w:tcMar>
+              <w:top w:type="dxa" w:w="40"/>
+              <w:left w:type="dxa" w:w="80"/>
+              <w:bottom w:type="dxa" w:w="40"/>
+              <w:right w:type="dxa" w:w="80"/>
+            </w:tcMar>
+            <w:vAlign w:val="top"/>
+          </w:tcPr>
+          <w:p>
+            <w:r>
+              <w:rPr>
+                <w:sz w:val="15"/>
+                <w:szCs w:val="15"/>
+              </w:rPr>
+              <w:t xml:space="preserve">26.2% (9)</w:t>
+            </w:r>
+          </w:p>
+        </w:tc>
+        <w:tc>
+          <w:tcPr>
+            <w:tcW w:type="dxa" w:w="1150"/>
+            <w:shd w:fill="F7F9FC" w:color="auto" w:val="clear"/>
+            <w:tcMar>
+              <w:top w:type="dxa" w:w="40"/>
+              <w:left w:type="dxa" w:w="80"/>
+              <w:bottom w:type="dxa" w:w="40"/>
+              <w:right w:type="dxa" w:w="80"/>
+            </w:tcMar>
+            <w:vAlign w:val="top"/>
+          </w:tcPr>
+          <w:p>
+            <w:r>
+              <w:rPr>
+                <w:sz w:val="15"/>
+                <w:szCs w:val="15"/>
+              </w:rPr>
+              <w:t xml:space="preserve">22.1% (6)</w:t>
+            </w:r>
+          </w:p>
+        </w:tc>
+        <w:tc>
+          <w:tcPr>
+            <w:tcW w:type="dxa" w:w="1500"/>
+            <w:shd w:fill="F7F9FC" w:color="auto" w:val="clear"/>
+            <w:tcMar>
+              <w:top w:type="dxa" w:w="40"/>
+              <w:left w:type="dxa" w:w="80"/>
+              <w:bottom w:type="dxa" w:w="40"/>
+              <w:right w:type="dxa" w:w="80"/>
+            </w:tcMar>
+            <w:vAlign w:val="top"/>
+          </w:tcPr>
+          <w:p>
+            <w:r>
+              <w:rPr>
+                <w:sz w:val="15"/>
+                <w:szCs w:val="15"/>
+              </w:rPr>
+              <w:t xml:space="preserve">42.2%</w:t>
+            </w:r>
+          </w:p>
+        </w:tc>
+        <w:tc>
+          <w:tcPr>
+            <w:tcW w:type="dxa" w:w="1588"/>
+            <w:shd w:fill="F7F9FC" w:color="auto" w:val="clear"/>
+            <w:tcMar>
+              <w:top w:type="dxa" w:w="40"/>
+              <w:left w:type="dxa" w:w="80"/>
+              <w:bottom w:type="dxa" w:w="40"/>
+              <w:right w:type="dxa" w:w="80"/>
+            </w:tcMar>
+            <w:vAlign w:val="top"/>
+          </w:tcPr>
+          <w:p>
+            <w:r>
+              <w:rPr>
+                <w:sz w:val="15"/>
+                <w:szCs w:val="15"/>
+              </w:rPr>
+              <w:t xml:space="preserve">26.3%</w:t>
+            </w:r>
+          </w:p>
+        </w:tc>
+      </w:tr>
+      <w:tr>
+        <w:trPr>
+          <w:cantSplit/>
+        </w:trPr>
+        <w:tc>
+          <w:tcPr>
+            <w:tcW w:type="dxa" w:w="3100"/>
+            <w:tcMar>
+              <w:top w:type="dxa" w:w="40"/>
+              <w:left w:type="dxa" w:w="80"/>
+              <w:bottom w:type="dxa" w:w="40"/>
+              <w:right w:type="dxa" w:w="80"/>
+            </w:tcMar>
+            <w:vAlign w:val="top"/>
+          </w:tcPr>
+          <w:p>
+            <w:r>
+              <w:rPr>
+                <w:sz w:val="15"/>
+                <w:szCs w:val="15"/>
+              </w:rPr>
+              <w:t xml:space="preserve">Anchor regression, γ → ∞ (IV)</w:t>
+            </w:r>
+          </w:p>
+        </w:tc>
+        <w:tc>
+          <w:tcPr>
+            <w:tcW w:type="dxa" w:w="1150"/>
+            <w:tcMar>
+              <w:top w:type="dxa" w:w="40"/>
+              <w:left w:type="dxa" w:w="80"/>
+              <w:bottom w:type="dxa" w:w="40"/>
+              <w:right w:type="dxa" w:w="80"/>
+            </w:tcMar>
+            <w:vAlign w:val="top"/>
+          </w:tcPr>
+          <w:p>
+            <w:r>
+              <w:rPr>
+                <w:sz w:val="15"/>
+                <w:szCs w:val="15"/>
+              </w:rPr>
+              <w:t xml:space="preserve">22.5% (7)</w:t>
+            </w:r>
+          </w:p>
+        </w:tc>
+        <w:tc>
+          <w:tcPr>
+            <w:tcW w:type="dxa" w:w="1150"/>
+            <w:tcMar>
+              <w:top w:type="dxa" w:w="40"/>
+              <w:left w:type="dxa" w:w="80"/>
+              <w:bottom w:type="dxa" w:w="40"/>
+              <w:right w:type="dxa" w:w="80"/>
+            </w:tcMar>
+            <w:vAlign w:val="top"/>
+          </w:tcPr>
+          <w:p>
+            <w:r>
+              <w:rPr>
+                <w:sz w:val="15"/>
+                <w:szCs w:val="15"/>
+              </w:rPr>
+              <w:t xml:space="preserve">30.9% (10)</w:t>
+            </w:r>
+          </w:p>
+        </w:tc>
+        <w:tc>
+          <w:tcPr>
+            <w:tcW w:type="dxa" w:w="1150"/>
+            <w:tcMar>
+              <w:top w:type="dxa" w:w="40"/>
+              <w:left w:type="dxa" w:w="80"/>
+              <w:bottom w:type="dxa" w:w="40"/>
+              <w:right w:type="dxa" w:w="80"/>
+            </w:tcMar>
+            <w:vAlign w:val="top"/>
+          </w:tcPr>
+          <w:p>
+            <w:r>
+              <w:rPr>
+                <w:sz w:val="15"/>
+                <w:szCs w:val="15"/>
+              </w:rPr>
+              <w:t xml:space="preserve">19.5% (8)</w:t>
+            </w:r>
+          </w:p>
+        </w:tc>
+        <w:tc>
+          <w:tcPr>
+            <w:tcW w:type="dxa" w:w="1500"/>
+            <w:tcMar>
+              <w:top w:type="dxa" w:w="40"/>
+              <w:left w:type="dxa" w:w="80"/>
+              <w:bottom w:type="dxa" w:w="40"/>
+              <w:right w:type="dxa" w:w="80"/>
+            </w:tcMar>
+            <w:vAlign w:val="top"/>
+          </w:tcPr>
+          <w:p>
+            <w:r>
+              <w:rPr>
+                <w:sz w:val="15"/>
+                <w:szCs w:val="15"/>
+              </w:rPr>
+              <w:t xml:space="preserve">52.1%</w:t>
+            </w:r>
+          </w:p>
+        </w:tc>
+        <w:tc>
+          <w:tcPr>
+            <w:tcW w:type="dxa" w:w="1588"/>
+            <w:tcMar>
+              <w:top w:type="dxa" w:w="40"/>
+              <w:left w:type="dxa" w:w="80"/>
+              <w:bottom w:type="dxa" w:w="40"/>
+              <w:right w:type="dxa" w:w="80"/>
+            </w:tcMar>
+            <w:vAlign w:val="top"/>
+          </w:tcPr>
+          <w:p>
+            <w:r>
+              <w:rPr>
+                <w:sz w:val="15"/>
+                <w:szCs w:val="15"/>
+              </w:rPr>
+              <w:t xml:space="preserve">22.1%</w:t>
+            </w:r>
+          </w:p>
+        </w:tc>
+      </w:tr>
+      <w:tr>
+        <w:trPr>
+          <w:cantSplit/>
+        </w:trPr>
+        <w:tc>
+          <w:tcPr>
+            <w:tcW w:type="dxa" w:w="3100"/>
+            <w:shd w:fill="F7F9FC" w:color="auto" w:val="clear"/>
+            <w:tcMar>
+              <w:top w:type="dxa" w:w="40"/>
+              <w:left w:type="dxa" w:w="80"/>
+              <w:bottom w:type="dxa" w:w="40"/>
+              <w:right w:type="dxa" w:w="80"/>
+            </w:tcMar>
+            <w:vAlign w:val="top"/>
+          </w:tcPr>
+          <w:p>
+            <w:r>
+              <w:rPr>
+                <w:sz w:val="15"/>
+                <w:szCs w:val="15"/>
+              </w:rPr>
+              <w:t xml:space="preserve">Least squares on heads and anchors</w:t>
+            </w:r>
+          </w:p>
+        </w:tc>
+        <w:tc>
+          <w:tcPr>
+            <w:tcW w:type="dxa" w:w="1150"/>
+            <w:shd w:fill="F7F9FC" w:color="auto" w:val="clear"/>
+            <w:tcMar>
+              <w:top w:type="dxa" w:w="40"/>
+              <w:left w:type="dxa" w:w="80"/>
+              <w:bottom w:type="dxa" w:w="40"/>
+              <w:right w:type="dxa" w:w="80"/>
+            </w:tcMar>
+            <w:vAlign w:val="top"/>
+          </w:tcPr>
+          <w:p>
+            <w:r>
+              <w:rPr>
+                <w:sz w:val="15"/>
+                <w:szCs w:val="15"/>
+              </w:rPr>
+              <w:t xml:space="preserve">40.2% (13)</w:t>
+            </w:r>
+          </w:p>
+        </w:tc>
+        <w:tc>
+          <w:tcPr>
+            <w:tcW w:type="dxa" w:w="1150"/>
+            <w:shd w:fill="F7F9FC" w:color="auto" w:val="clear"/>
+            <w:tcMar>
+              <w:top w:type="dxa" w:w="40"/>
+              <w:left w:type="dxa" w:w="80"/>
+              <w:bottom w:type="dxa" w:w="40"/>
+              <w:right w:type="dxa" w:w="80"/>
+            </w:tcMar>
+            <w:vAlign w:val="top"/>
+          </w:tcPr>
+          <w:p>
+            <w:r>
+              <w:rPr>
+                <w:sz w:val="15"/>
+                <w:szCs w:val="15"/>
+              </w:rPr>
+              <w:t xml:space="preserve">38.3% (11)</w:t>
+            </w:r>
+          </w:p>
+        </w:tc>
+        <w:tc>
+          <w:tcPr>
+            <w:tcW w:type="dxa" w:w="1150"/>
+            <w:shd w:fill="F7F9FC" w:color="auto" w:val="clear"/>
+            <w:tcMar>
+              <w:top w:type="dxa" w:w="40"/>
+              <w:left w:type="dxa" w:w="80"/>
+              <w:bottom w:type="dxa" w:w="40"/>
+              <w:right w:type="dxa" w:w="80"/>
+            </w:tcMar>
+            <w:vAlign w:val="top"/>
+          </w:tcPr>
+          <w:p>
+            <w:r>
+              <w:rPr>
+                <w:sz w:val="15"/>
+                <w:szCs w:val="15"/>
+              </w:rPr>
+              <w:t xml:space="preserve">33.8% (12)</w:t>
+            </w:r>
+          </w:p>
+        </w:tc>
+        <w:tc>
+          <w:tcPr>
+            <w:tcW w:type="dxa" w:w="1500"/>
+            <w:shd w:fill="F7F9FC" w:color="auto" w:val="clear"/>
+            <w:tcMar>
+              <w:top w:type="dxa" w:w="40"/>
+              <w:left w:type="dxa" w:w="80"/>
+              <w:bottom w:type="dxa" w:w="40"/>
+              <w:right w:type="dxa" w:w="80"/>
+            </w:tcMar>
+            <w:vAlign w:val="top"/>
+          </w:tcPr>
+          <w:p>
+            <w:r>
+              <w:rPr>
+                <w:sz w:val="15"/>
+                <w:szCs w:val="15"/>
+              </w:rPr>
+              <w:t xml:space="preserve">33.2%</w:t>
+            </w:r>
+          </w:p>
+        </w:tc>
+        <w:tc>
+          <w:tcPr>
+            <w:tcW w:type="dxa" w:w="1588"/>
+            <w:shd w:fill="F7F9FC" w:color="auto" w:val="clear"/>
+            <w:tcMar>
+              <w:top w:type="dxa" w:w="40"/>
+              <w:left w:type="dxa" w:w="80"/>
+              <w:bottom w:type="dxa" w:w="40"/>
+              <w:right w:type="dxa" w:w="80"/>
+            </w:tcMar>
+            <w:vAlign w:val="top"/>
+          </w:tcPr>
+          <w:p>
+            <w:r>
+              <w:rPr>
+                <w:sz w:val="15"/>
+                <w:szCs w:val="15"/>
+              </w:rPr>
+              <w:t xml:space="preserve">29.2%</w:t>
+            </w:r>
+          </w:p>
+        </w:tc>
+      </w:tr>
+      <w:tr>
+        <w:trPr>
+          <w:cantSplit/>
+        </w:trPr>
+        <w:tc>
+          <w:tcPr>
+            <w:tcW w:type="dxa" w:w="3100"/>
+            <w:tcMar>
+              <w:top w:type="dxa" w:w="40"/>
+              <w:left w:type="dxa" w:w="80"/>
+              <w:bottom w:type="dxa" w:w="40"/>
+              <w:right w:type="dxa" w:w="80"/>
+            </w:tcMar>
+            <w:vAlign w:val="top"/>
+          </w:tcPr>
+          <w:p>
+            <w:r>
+              <w:rPr>
+                <w:sz w:val="15"/>
+                <w:szCs w:val="15"/>
+              </w:rPr>
+              <w:t xml:space="preserve">… re-anchored by a yearly chloride sample</w:t>
+            </w:r>
+          </w:p>
+        </w:tc>
+        <w:tc>
+          <w:tcPr>
+            <w:tcW w:type="dxa" w:w="1150"/>
+            <w:tcMar>
+              <w:top w:type="dxa" w:w="40"/>
+              <w:left w:type="dxa" w:w="80"/>
+              <w:bottom w:type="dxa" w:w="40"/>
+              <w:right w:type="dxa" w:w="80"/>
+            </w:tcMar>
+            <w:vAlign w:val="top"/>
+          </w:tcPr>
+          <w:p>
+            <w:r>
+              <w:rPr>
+                <w:sz w:val="15"/>
+                <w:szCs w:val="15"/>
+              </w:rPr>
+              <w:t xml:space="preserve">24.7% (9)</w:t>
+            </w:r>
+          </w:p>
+        </w:tc>
+        <w:tc>
+          <w:tcPr>
+            <w:tcW w:type="dxa" w:w="1150"/>
+            <w:tcMar>
+              <w:top w:type="dxa" w:w="40"/>
+              <w:left w:type="dxa" w:w="80"/>
+              <w:bottom w:type="dxa" w:w="40"/>
+              <w:right w:type="dxa" w:w="80"/>
+            </w:tcMar>
+            <w:vAlign w:val="top"/>
+          </w:tcPr>
+          <w:p>
+            <w:r>
+              <w:rPr>
+                <w:sz w:val="15"/>
+                <w:szCs w:val="15"/>
+              </w:rPr>
+              <w:t xml:space="preserve">23.2% (9)</w:t>
+            </w:r>
+          </w:p>
+        </w:tc>
+        <w:tc>
+          <w:tcPr>
+            <w:tcW w:type="dxa" w:w="1150"/>
+            <w:tcMar>
+              <w:top w:type="dxa" w:w="40"/>
+              <w:left w:type="dxa" w:w="80"/>
+              <w:bottom w:type="dxa" w:w="40"/>
+              <w:right w:type="dxa" w:w="80"/>
+            </w:tcMar>
+            <w:vAlign w:val="top"/>
+          </w:tcPr>
+          <w:p>
+            <w:r>
+              <w:rPr>
+                <w:sz w:val="15"/>
+                <w:szCs w:val="15"/>
+              </w:rPr>
+              <w:t xml:space="preserve">24.7% (9)</w:t>
+            </w:r>
+          </w:p>
+        </w:tc>
+        <w:tc>
+          <w:tcPr>
+            <w:tcW w:type="dxa" w:w="1500"/>
+            <w:tcMar>
+              <w:top w:type="dxa" w:w="40"/>
+              <w:left w:type="dxa" w:w="80"/>
+              <w:bottom w:type="dxa" w:w="40"/>
+              <w:right w:type="dxa" w:w="80"/>
+            </w:tcMar>
+            <w:vAlign w:val="top"/>
+          </w:tcPr>
+          <w:p>
+            <w:r>
+              <w:rPr>
+                <w:sz w:val="15"/>
+                <w:szCs w:val="15"/>
+              </w:rPr>
+              <w:t xml:space="preserve">29.8%</w:t>
+            </w:r>
+          </w:p>
+        </w:tc>
+        <w:tc>
+          <w:tcPr>
+            <w:tcW w:type="dxa" w:w="1588"/>
+            <w:tcMar>
+              <w:top w:type="dxa" w:w="40"/>
+              <w:left w:type="dxa" w:w="80"/>
+              <w:bottom w:type="dxa" w:w="40"/>
+              <w:right w:type="dxa" w:w="80"/>
+            </w:tcMar>
+            <w:vAlign w:val="top"/>
+          </w:tcPr>
+          <w:p>
+            <w:r>
+              <w:rPr>
+                <w:sz w:val="15"/>
+                <w:szCs w:val="15"/>
+              </w:rPr>
+              <w:t xml:space="preserve">9.8%</w:t>
+            </w:r>
+          </w:p>
+        </w:tc>
+      </w:tr>
+      <w:tr>
+        <w:trPr>
+          <w:cantSplit/>
+        </w:trPr>
+        <w:tc>
+          <w:tcPr>
+            <w:tcW w:type="dxa" w:w="3100"/>
+            <w:shd w:fill="F7F9FC" w:color="auto" w:val="clear"/>
+            <w:tcMar>
+              <w:top w:type="dxa" w:w="40"/>
+              <w:left w:type="dxa" w:w="80"/>
+              <w:bottom w:type="dxa" w:w="40"/>
+              <w:right w:type="dxa" w:w="80"/>
+            </w:tcMar>
+            <w:vAlign w:val="top"/>
+          </w:tcPr>
+          <w:p>
+            <w:r>
+              <w:rPr>
+                <w:sz w:val="15"/>
+                <w:szCs w:val="15"/>
+              </w:rPr>
+              <w:t xml:space="preserve">Least squares + SPIRANCA-GO certificate</w:t>
+            </w:r>
+          </w:p>
+        </w:tc>
+        <w:tc>
+          <w:tcPr>
+            <w:tcW w:type="dxa" w:w="1150"/>
+            <w:shd w:fill="F7F9FC" w:color="auto" w:val="clear"/>
+            <w:tcMar>
+              <w:top w:type="dxa" w:w="40"/>
+              <w:left w:type="dxa" w:w="80"/>
+              <w:bottom w:type="dxa" w:w="40"/>
+              <w:right w:type="dxa" w:w="80"/>
+            </w:tcMar>
+            <w:vAlign w:val="top"/>
+          </w:tcPr>
+          <w:p>
+            <w:r>
+              <w:rPr>
+                <w:sz w:val="15"/>
+                <w:szCs w:val="15"/>
+              </w:rPr>
+              <w:t xml:space="preserve">4.3% (2)</w:t>
+            </w:r>
+          </w:p>
+        </w:tc>
+        <w:tc>
+          <w:tcPr>
+            <w:tcW w:type="dxa" w:w="1150"/>
+            <w:shd w:fill="F7F9FC" w:color="auto" w:val="clear"/>
+            <w:tcMar>
+              <w:top w:type="dxa" w:w="40"/>
+              <w:left w:type="dxa" w:w="80"/>
+              <w:bottom w:type="dxa" w:w="40"/>
+              <w:right w:type="dxa" w:w="80"/>
+            </w:tcMar>
+            <w:vAlign w:val="top"/>
+          </w:tcPr>
+          <w:p>
+            <w:r>
+              <w:rPr>
+                <w:sz w:val="15"/>
+                <w:szCs w:val="15"/>
+              </w:rPr>
+              <w:t xml:space="preserve">5.0% (2)</w:t>
+            </w:r>
+          </w:p>
+        </w:tc>
+        <w:tc>
+          <w:tcPr>
+            <w:tcW w:type="dxa" w:w="1150"/>
+            <w:shd w:fill="F7F9FC" w:color="auto" w:val="clear"/>
+            <w:tcMar>
+              <w:top w:type="dxa" w:w="40"/>
+              <w:left w:type="dxa" w:w="80"/>
+              <w:bottom w:type="dxa" w:w="40"/>
+              <w:right w:type="dxa" w:w="80"/>
+            </w:tcMar>
+            <w:vAlign w:val="top"/>
+          </w:tcPr>
+          <w:p>
+            <w:r>
+              <w:rPr>
+                <w:sz w:val="15"/>
+                <w:szCs w:val="15"/>
+              </w:rPr>
+              <w:t xml:space="preserve">3.8% (2)</w:t>
+            </w:r>
+          </w:p>
+        </w:tc>
+        <w:tc>
+          <w:tcPr>
+            <w:tcW w:type="dxa" w:w="1500"/>
+            <w:shd w:fill="F7F9FC" w:color="auto" w:val="clear"/>
+            <w:tcMar>
+              <w:top w:type="dxa" w:w="40"/>
+              <w:left w:type="dxa" w:w="80"/>
+              <w:bottom w:type="dxa" w:w="40"/>
+              <w:right w:type="dxa" w:w="80"/>
+            </w:tcMar>
+            <w:vAlign w:val="top"/>
+          </w:tcPr>
+          <w:p>
+            <w:r>
+              <w:rPr>
+                <w:sz w:val="15"/>
+                <w:szCs w:val="15"/>
+              </w:rPr>
+              <w:t xml:space="preserve">79.1%</w:t>
+            </w:r>
+          </w:p>
+        </w:tc>
+        <w:tc>
+          <w:tcPr>
+            <w:tcW w:type="dxa" w:w="1588"/>
+            <w:shd w:fill="F7F9FC" w:color="auto" w:val="clear"/>
+            <w:tcMar>
+              <w:top w:type="dxa" w:w="40"/>
+              <w:left w:type="dxa" w:w="80"/>
+              <w:bottom w:type="dxa" w:w="40"/>
+              <w:right w:type="dxa" w:w="80"/>
+            </w:tcMar>
+            <w:vAlign w:val="top"/>
+          </w:tcPr>
+          <w:p>
+            <w:r>
+              <w:rPr>
+                <w:sz w:val="15"/>
+                <w:szCs w:val="15"/>
+              </w:rPr>
+              <w:t xml:space="preserve">5.2%</w:t>
+            </w:r>
+          </w:p>
+        </w:tc>
+      </w:tr>
+      <w:tr>
+        <w:trPr>
+          <w:cantSplit/>
+        </w:trPr>
+        <w:tc>
+          <w:tcPr>
+            <w:tcW w:type="dxa" w:w="3100"/>
+            <w:tcMar>
+              <w:top w:type="dxa" w:w="40"/>
+              <w:left w:type="dxa" w:w="80"/>
+              <w:bottom w:type="dxa" w:w="40"/>
+              <w:right w:type="dxa" w:w="80"/>
+            </w:tcMar>
+            <w:vAlign w:val="top"/>
+          </w:tcPr>
+          <w:p>
+            <w:r>
+              <w:rPr>
+                <w:sz w:val="15"/>
+                <w:szCs w:val="15"/>
+              </w:rPr>
+              <w:t xml:space="preserve">SPIRANCA-GO</w:t>
+            </w:r>
+          </w:p>
+        </w:tc>
+        <w:tc>
+          <w:tcPr>
+            <w:tcW w:type="dxa" w:w="1150"/>
+            <w:tcMar>
+              <w:top w:type="dxa" w:w="40"/>
+              <w:left w:type="dxa" w:w="80"/>
+              <w:bottom w:type="dxa" w:w="40"/>
+              <w:right w:type="dxa" w:w="80"/>
+            </w:tcMar>
+            <w:vAlign w:val="top"/>
+          </w:tcPr>
+          <w:p>
+            <w:r>
+              <w:rPr>
+                <w:sz w:val="15"/>
+                <w:szCs w:val="15"/>
+              </w:rPr>
+              <w:t xml:space="preserve">26.3% (9)</w:t>
+            </w:r>
+          </w:p>
+        </w:tc>
+        <w:tc>
+          <w:tcPr>
+            <w:tcW w:type="dxa" w:w="1150"/>
+            <w:tcMar>
+              <w:top w:type="dxa" w:w="40"/>
+              <w:left w:type="dxa" w:w="80"/>
+              <w:bottom w:type="dxa" w:w="40"/>
+              <w:right w:type="dxa" w:w="80"/>
+            </w:tcMar>
+            <w:vAlign w:val="top"/>
+          </w:tcPr>
+          <w:p>
+            <w:r>
+              <w:rPr>
+                <w:sz w:val="15"/>
+                <w:szCs w:val="15"/>
+              </w:rPr>
+              <w:t xml:space="preserve">9.3% (2)</w:t>
+            </w:r>
+          </w:p>
+        </w:tc>
+        <w:tc>
+          <w:tcPr>
+            <w:tcW w:type="dxa" w:w="1150"/>
+            <w:tcMar>
+              <w:top w:type="dxa" w:w="40"/>
+              <w:left w:type="dxa" w:w="80"/>
+              <w:bottom w:type="dxa" w:w="40"/>
+              <w:right w:type="dxa" w:w="80"/>
+            </w:tcMar>
+            <w:vAlign w:val="top"/>
+          </w:tcPr>
+          <w:p>
+            <w:r>
+              <w:rPr>
+                <w:sz w:val="15"/>
+                <w:szCs w:val="15"/>
+              </w:rPr>
+              <w:t xml:space="preserve">17.2% (8)</w:t>
+            </w:r>
+          </w:p>
+        </w:tc>
+        <w:tc>
+          <w:tcPr>
+            <w:tcW w:type="dxa" w:w="1500"/>
+            <w:tcMar>
+              <w:top w:type="dxa" w:w="40"/>
+              <w:left w:type="dxa" w:w="80"/>
+              <w:bottom w:type="dxa" w:w="40"/>
+              <w:right w:type="dxa" w:w="80"/>
+            </w:tcMar>
+            <w:vAlign w:val="top"/>
+          </w:tcPr>
+          <w:p>
+            <w:r>
+              <w:rPr>
+                <w:sz w:val="15"/>
+                <w:szCs w:val="15"/>
+              </w:rPr>
+              <w:t xml:space="preserve">43.6%</w:t>
+            </w:r>
+          </w:p>
+        </w:tc>
+        <w:tc>
+          <w:tcPr>
+            <w:tcW w:type="dxa" w:w="1588"/>
+            <w:tcMar>
+              <w:top w:type="dxa" w:w="40"/>
+              <w:left w:type="dxa" w:w="80"/>
+              <w:bottom w:type="dxa" w:w="40"/>
+              <w:right w:type="dxa" w:w="80"/>
+            </w:tcMar>
+            <w:vAlign w:val="top"/>
+          </w:tcPr>
+          <w:p>
+            <w:r>
+              <w:rPr>
+                <w:sz w:val="15"/>
+                <w:szCs w:val="15"/>
+              </w:rPr>
+              <w:t xml:space="preserve">24.2%</w:t>
+            </w:r>
+          </w:p>
+        </w:tc>
+      </w:tr>
+      <w:tr>
+        <w:trPr>
+          <w:cantSplit/>
+        </w:trPr>
+        <w:tc>
+          <w:tcPr>
+            <w:tcW w:type="dxa" w:w="3100"/>
+            <w:shd w:fill="F7F9FC" w:color="auto" w:val="clear"/>
+            <w:tcMar>
+              <w:top w:type="dxa" w:w="40"/>
+              <w:left w:type="dxa" w:w="80"/>
+              <w:bottom w:type="dxa" w:w="40"/>
+              <w:right w:type="dxa" w:w="80"/>
+            </w:tcMar>
+            <w:vAlign w:val="top"/>
+          </w:tcPr>
+          <w:p>
+            <w:r>
+              <w:rPr>
+                <w:sz w:val="15"/>
+                <w:szCs w:val="15"/>
+              </w:rPr>
+              <w:t xml:space="preserve">SPIRANCA-GO re-anchored by a yearly chloride sample</w:t>
+            </w:r>
+          </w:p>
+        </w:tc>
+        <w:tc>
+          <w:tcPr>
+            <w:tcW w:type="dxa" w:w="1150"/>
+            <w:shd w:fill="F7F9FC" w:color="auto" w:val="clear"/>
+            <w:tcMar>
+              <w:top w:type="dxa" w:w="40"/>
+              <w:left w:type="dxa" w:w="80"/>
+              <w:bottom w:type="dxa" w:w="40"/>
+              <w:right w:type="dxa" w:w="80"/>
+            </w:tcMar>
+            <w:vAlign w:val="top"/>
+          </w:tcPr>
+          <w:p>
+            <w:r>
+              <w:rPr>
+                <w:sz w:val="15"/>
+                <w:szCs w:val="15"/>
+              </w:rPr>
+              <w:t xml:space="preserve">3.4% (1)</w:t>
+            </w:r>
+          </w:p>
+        </w:tc>
+        <w:tc>
+          <w:tcPr>
+            <w:tcW w:type="dxa" w:w="1150"/>
+            <w:shd w:fill="F7F9FC" w:color="auto" w:val="clear"/>
+            <w:tcMar>
+              <w:top w:type="dxa" w:w="40"/>
+              <w:left w:type="dxa" w:w="80"/>
+              <w:bottom w:type="dxa" w:w="40"/>
+              <w:right w:type="dxa" w:w="80"/>
+            </w:tcMar>
+            <w:vAlign w:val="top"/>
+          </w:tcPr>
+          <w:p>
+            <w:r>
+              <w:rPr>
+                <w:sz w:val="15"/>
+                <w:szCs w:val="15"/>
+              </w:rPr>
+              <w:t xml:space="preserve">3.1% (1)</w:t>
+            </w:r>
+          </w:p>
+        </w:tc>
+        <w:tc>
+          <w:tcPr>
+            <w:tcW w:type="dxa" w:w="1150"/>
+            <w:shd w:fill="F7F9FC" w:color="auto" w:val="clear"/>
+            <w:tcMar>
+              <w:top w:type="dxa" w:w="40"/>
+              <w:left w:type="dxa" w:w="80"/>
+              <w:bottom w:type="dxa" w:w="40"/>
+              <w:right w:type="dxa" w:w="80"/>
+            </w:tcMar>
+            <w:vAlign w:val="top"/>
+          </w:tcPr>
+          <w:p>
+            <w:r>
+              <w:rPr>
+                <w:sz w:val="15"/>
+                <w:szCs w:val="15"/>
+              </w:rPr>
+              <w:t xml:space="preserve">3.1% (1)</w:t>
+            </w:r>
+          </w:p>
+        </w:tc>
+        <w:tc>
+          <w:tcPr>
+            <w:tcW w:type="dxa" w:w="1500"/>
+            <w:shd w:fill="F7F9FC" w:color="auto" w:val="clear"/>
+            <w:tcMar>
+              <w:top w:type="dxa" w:w="40"/>
+              <w:left w:type="dxa" w:w="80"/>
+              <w:bottom w:type="dxa" w:w="40"/>
+              <w:right w:type="dxa" w:w="80"/>
+            </w:tcMar>
+            <w:vAlign w:val="top"/>
+          </w:tcPr>
+          <w:p>
+            <w:r>
+              <w:rPr>
+                <w:sz w:val="15"/>
+                <w:szCs w:val="15"/>
+              </w:rPr>
+              <w:t xml:space="preserve">53.9%</w:t>
+            </w:r>
+          </w:p>
+        </w:tc>
+        <w:tc>
+          <w:tcPr>
+            <w:tcW w:type="dxa" w:w="1588"/>
+            <w:shd w:fill="F7F9FC" w:color="auto" w:val="clear"/>
+            <w:tcMar>
+              <w:top w:type="dxa" w:w="40"/>
+              <w:left w:type="dxa" w:w="80"/>
+              <w:bottom w:type="dxa" w:w="40"/>
+              <w:right w:type="dxa" w:w="80"/>
+            </w:tcMar>
+            <w:vAlign w:val="top"/>
+          </w:tcPr>
+          <w:p>
+            <w:r>
+              <w:rPr>
+                <w:sz w:val="15"/>
+                <w:szCs w:val="15"/>
+              </w:rPr>
+              <w:t xml:space="preserve">1.1%</w:t>
+            </w:r>
+          </w:p>
+        </w:tc>
+      </w:tr>
+    </w:tbl>
+    <w:p>
+      <w:pPr>
+        <w:spacing w:after="120"/>
+      </w:pPr>
+    </w:p>
+    <w:p>
+      <w:pPr>
+        <w:spacing w:after="100"/>
+        <w:jc w:val="both"/>
+      </w:pPr>
+      <w:r>
+        <w:t xml:space="preserve">Table 8 gives a different picture from the areal test. The static SPIRANCA-GO alarm holds under the worst unrecorded warming in 18 of the 20 aquifers (9.3% on average), as the certificate says it should. After the decision alone, however, it over-predicts in 26.3% of the seasons and fails in 9 aquifers. Least squares on heads and anchors fails in 13, and the heads alone in 8. The only static alarm that stays below 10% is least squares with the SPIRANCA-GO certificate added (4.3%), and it does so by sounding in 79% of the safe seasons: a margin of 4.9 standard deviations of the record makes it an alarm that is almost always on.</w:t>
+      </w:r>
+    </w:p>
+    <w:p>
+      <w:pPr>
+        <w:spacing w:after="100"/>
+        <w:jc w:val="both"/>
+      </w:pPr>
+      <w:r>
+        <w:t xml:space="preserve">The failures have one cause. They occur where the screen was still almost fresh at the end of the record (median sea fraction 3% of the limit, against 9% where the alarm held). There the decision moves the screen into a regime the record never saw: the mixing zone reaches the screen, and in the aquifer of Figure 4b chloride rises from 35 to 300 mg/L in five years. The anchor correction of Proposition S1 is linear in the anchors and was fitted where the screen hardly responded, so it predicts a small change where a large one comes (Figure 4b). The warming does not cause the same failure, because its direction was in the record: droughts lasting several years were. A sustained increase of pumping in an aquifer whose screen has not yet felt the sea was not. Proposition S1 assumes that the decision enters linearly through the anchors, and it does not hold here.</w:t>
+      </w:r>
+    </w:p>
+    <w:p>
+      <w:pPr>
+        <w:pStyle w:val="Heading2"/>
+      </w:pPr>
+      <w:r>
+        <w:t xml:space="preserve">7.2 Re-anchoring with one chloride sample a year</w:t>
+      </w:r>
+    </w:p>
+    <w:p>
+      <w:pPr>
+        <w:spacing w:after="100"/>
+        <w:jc w:val="both"/>
+      </w:pPr>
+      <w:r>
+        <w:t xml:space="preserve">The remedy is to measure the goal itself, rarely. After the decision, one chloride sample is taken at the supply screen at the end of each year, and between samples the alarm subtracts from its prediction the mean error of the last 3 samples. The heads still give the season-to-season signal; the samples remove the slow drift that the record could not foresee.</w:t>
+      </w:r>
+    </w:p>
+    <w:p>
+      <w:pPr>
+        <w:keepNext w:val="false"/>
+        <w:pBdr>
+          <w:left w:val="single" w:color="C2410C" w:sz="18" w:space="6"/>
+        </w:pBdr>
+        <w:shd w:fill="FDF2E9" w:color="auto" w:val="clear"/>
+        <w:spacing w:after="100" w:before="100"/>
+        <w:ind w:left="140" w:right="60"/>
+        <w:jc w:val="left"/>
+      </w:pPr>
+      <w:r>
+        <w:rPr>
+          <w:b/>
+          <w:bCs/>
+          <w:color w:val="C2410C"/>
+        </w:rPr>
+        <w:t xml:space="preserve">Proposition S5 (re-anchoring turns the drift of the decision into a lag). </w:t>
+      </w:r>
+      <w:r>
+        <w:t xml:space="preserve">After the decision let the error of the alarm be </w:t>
+      </w:r>
+      <m:oMath>
+        <m:sSub>
+          <m:e>
+            <m:acc>
+              <m:accPr>
+                <m:chr m:val="̂"/>
+              </m:accPr>
+              <m:e>
+                <m:r>
+                  <m:t>Y</m:t>
+                </m:r>
+              </m:e>
+            </m:acc>
+          </m:e>
+          <m:sub>
+            <m:r>
+              <m:t>t</m:t>
+            </m:r>
+          </m:sub>
+        </m:sSub>
+        <m:r>
+          <m:rPr>
+            <m:sty m:val="p"/>
+          </m:rPr>
+          <m:t>−</m:t>
+        </m:r>
+        <m:sSub>
+          <m:e>
+            <m:r>
+              <m:t>Y</m:t>
+            </m:r>
+          </m:e>
+          <m:sub>
+            <m:r>
+              <m:t>t</m:t>
+            </m:r>
+          </m:sub>
+        </m:sSub>
+        <m:r>
+          <m:rPr>
+            <m:sty m:val="p"/>
+          </m:rPr>
+          <m:t>=</m:t>
+        </m:r>
+        <m:r>
+          <m:rPr>
+            <m:sty m:val="p"/>
+          </m:rPr>
+          <m:t>−</m:t>
+        </m:r>
+        <m:sSub>
+          <m:e>
+            <m:r>
+              <m:t>η</m:t>
+            </m:r>
+          </m:e>
+          <m:sub>
+            <m:r>
+              <m:t>t</m:t>
+            </m:r>
+          </m:sub>
+        </m:sSub>
+        <m:r>
+          <m:rPr>
+            <m:sty m:val="p"/>
+          </m:rPr>
+          <m:t>+</m:t>
+        </m:r>
+        <m:sSub>
+          <m:e>
+            <m:r>
+              <m:t>d</m:t>
+            </m:r>
+          </m:e>
+          <m:sub>
+            <m:r>
+              <m:t>t</m:t>
+            </m:r>
+          </m:sub>
+        </m:sSub>
+      </m:oMath>
+      <w:r>
+        <w:t xml:space="preserve">, where </w:t>
+      </w:r>
+      <m:oMath>
+        <m:sSub>
+          <m:e>
+            <m:r>
+              <m:t>η</m:t>
+            </m:r>
+          </m:e>
+          <m:sub>
+            <m:r>
+              <m:t>t</m:t>
+            </m:r>
+          </m:sub>
+        </m:sSub>
+      </m:oMath>
+      <w:r>
+        <w:t xml:space="preserve"> has its law in the record and </w:t>
+      </w:r>
+      <m:oMath>
+        <m:sSub>
+          <m:e>
+            <m:r>
+              <m:t>d</m:t>
+            </m:r>
+          </m:e>
+          <m:sub>
+            <m:r>
+              <m:t>t</m:t>
+            </m:r>
+          </m:sub>
+        </m:sSub>
+      </m:oMath>
+      <w:r>
+        <w:t xml:space="preserve"> is the drift the record could not foresee, with </w:t>
+      </w:r>
+      <m:oMath>
+        <m:d>
+          <m:dPr>
+            <m:begChr m:val="|"/>
+            <m:sepChr m:val=""/>
+            <m:endChr m:val="|"/>
+            <m:grow/>
+          </m:dPr>
+          <m:e>
+            <m:sSub>
+              <m:e>
+                <m:r>
+                  <m:t>d</m:t>
+                </m:r>
+              </m:e>
+              <m:sub>
+                <m:r>
+                  <m:t>t</m:t>
+                </m:r>
+              </m:sub>
+            </m:sSub>
+            <m:r>
+              <m:rPr>
+                <m:sty m:val="p"/>
+              </m:rPr>
+              <m:t>−</m:t>
+            </m:r>
+            <m:sSub>
+              <m:e>
+                <m:r>
+                  <m:t>d</m:t>
+                </m:r>
+              </m:e>
+              <m:sub>
+                <m:r>
+                  <m:t>s</m:t>
+                </m:r>
+              </m:sub>
+            </m:sSub>
+          </m:e>
+        </m:d>
+        <m:r>
+          <m:rPr>
+            <m:sty m:val="p"/>
+          </m:rPr>
+          <m:t>≤</m:t>
+        </m:r>
+        <m:r>
+          <m:t>ρ</m:t>
+        </m:r>
+        <m:r>
+          <m:t> </m:t>
+        </m:r>
+        <m:d>
+          <m:dPr>
+            <m:begChr m:val="|"/>
+            <m:sepChr m:val=""/>
+            <m:endChr m:val="|"/>
+            <m:grow/>
+          </m:dPr>
+          <m:e>
+            <m:r>
+              <m:t>t</m:t>
+            </m:r>
+            <m:r>
+              <m:rPr>
+                <m:sty m:val="p"/>
+              </m:rPr>
+              <m:t>−</m:t>
+            </m:r>
+            <m:r>
+              <m:t>s</m:t>
+            </m:r>
+          </m:e>
+        </m:d>
+      </m:oMath>
+      <w:r>
+        <w:t xml:space="preserve"> (in years). Subtract from the prediction the mean error of the last </w:t>
+      </w:r>
+      <m:oMath>
+        <m:r>
+          <m:t>K</m:t>
+        </m:r>
+      </m:oMath>
+      <w:r>
+        <w:t xml:space="preserve"> yearly samples, taken at </w:t>
+      </w:r>
+      <m:oMath>
+        <m:r>
+          <m:t>t</m:t>
+        </m:r>
+        <m:r>
+          <m:rPr>
+            <m:sty m:val="p"/>
+          </m:rPr>
+          <m:t>−</m:t>
+        </m:r>
+        <m:r>
+          <m:t>1</m:t>
+        </m:r>
+        <m:r>
+          <m:rPr>
+            <m:sty m:val="p"/>
+          </m:rPr>
+          <m:t>,</m:t>
+        </m:r>
+        <m:r>
+          <m:rPr>
+            <m:sty m:val="p"/>
+          </m:rPr>
+          <m:t>…</m:t>
+        </m:r>
+        <m:r>
+          <m:rPr>
+            <m:sty m:val="p"/>
+          </m:rPr>
+          <m:t>,</m:t>
+        </m:r>
+        <m:r>
+          <m:t>t</m:t>
+        </m:r>
+        <m:r>
+          <m:rPr>
+            <m:sty m:val="p"/>
+          </m:rPr>
+          <m:t>−</m:t>
+        </m:r>
+        <m:r>
+          <m:t>K</m:t>
+        </m:r>
+      </m:oMath>
+      <w:r>
+        <w:t xml:space="preserve"> years. Then</w:t>
+      </w:r>
+    </w:p>
+    <w:tbl>
+      <w:tblPr>
+        <w:tblW w:type="dxa" w:w="9638"/>
+        <w:tblBorders>
+          <w:top w:val="none" w:color="FFFFFF" w:sz="0"/>
+          <w:left w:val="none" w:color="FFFFFF" w:sz="0"/>
+          <w:bottom w:val="none" w:color="FFFFFF" w:sz="0"/>
+          <w:right w:val="none" w:color="FFFFFF" w:sz="0"/>
+          <w:insideH w:val="none" w:color="FFFFFF" w:sz="0"/>
+          <w:insideV w:val="none" w:color="FFFFFF" w:sz="0"/>
+        </w:tblBorders>
+        <w:tblLayout w:type="fixed"/>
+      </w:tblPr>
+      <w:tblGrid>
+        <w:gridCol w:w="8858"/>
+        <w:gridCol w:w="780"/>
+      </w:tblGrid>
+      <w:tr>
+        <w:trPr>
+          <w:cantSplit/>
+        </w:trPr>
+        <w:tc>
+          <w:tcPr>
+            <w:tcW w:type="dxa" w:w="8858"/>
+            <w:tcBorders>
+              <w:top w:val="none" w:color="FFFFFF" w:sz="0"/>
+              <w:left w:val="none" w:color="FFFFFF" w:sz="0"/>
+              <w:bottom w:val="none" w:color="FFFFFF" w:sz="0"/>
+              <w:right w:val="none" w:color="FFFFFF" w:sz="0"/>
+            </w:tcBorders>
+            <w:tcMar>
+              <w:top w:type="dxa" w:w="20"/>
+              <w:left w:type="dxa" w:w="0"/>
+              <w:bottom w:type="dxa" w:w="20"/>
+              <w:right w:type="dxa" w:w="0"/>
+            </w:tcMar>
+            <w:vAlign w:val="center"/>
+          </w:tcPr>
+          <w:p>
+            <w:pPr>
+              <w:pStyle w:val="Equation"/>
+              <w:keepNext/>
+            </w:pPr>
+            <m:oMathPara>
+              <m:oMathParaPr>
+                <m:jc m:val="center"/>
+              </m:oMathParaPr>
+              <m:oMath>
+                <m:sSub>
+                  <m:e>
+                    <m:acc>
+                      <m:accPr>
+                        <m:chr m:val="̂"/>
+                      </m:accPr>
+                      <m:e>
+                        <m:r>
+                          <m:t>Y</m:t>
+                        </m:r>
+                      </m:e>
+                    </m:acc>
+                  </m:e>
+                  <m:sub>
+                    <m:r>
+                      <m:t>t</m:t>
+                    </m:r>
+                  </m:sub>
+                </m:sSub>
+                <m:r>
+                  <m:rPr>
+                    <m:sty m:val="p"/>
+                  </m:rPr>
+                  <m:t>−</m:t>
+                </m:r>
+                <m:sSub>
+                  <m:e>
+                    <m:bar>
+                      <m:barPr>
+                        <m:pos m:val="top"/>
+                      </m:barPr>
+                      <m:e>
+                        <m:r>
+                          <m:t>e</m:t>
+                        </m:r>
+                      </m:e>
+                    </m:bar>
+                  </m:e>
+                  <m:sub>
+                    <m:r>
+                      <m:t>t</m:t>
+                    </m:r>
+                    <m:r>
+                      <m:rPr>
+                        <m:sty m:val="p"/>
+                      </m:rPr>
+                      <m:t>,</m:t>
+                    </m:r>
+                    <m:r>
+                      <m:t>K</m:t>
+                    </m:r>
+                  </m:sub>
+                </m:sSub>
+                <m:r>
+                  <m:rPr>
+                    <m:sty m:val="p"/>
+                  </m:rPr>
+                  <m:t>−</m:t>
+                </m:r>
+                <m:sSub>
+                  <m:e>
+                    <m:r>
+                      <m:t>Y</m:t>
+                    </m:r>
+                  </m:e>
+                  <m:sub>
+                    <m:r>
+                      <m:t>t</m:t>
+                    </m:r>
+                  </m:sub>
+                </m:sSub>
+                <m:r>
+                  <m:rPr>
+                    <m:sty m:val="p"/>
+                  </m:rPr>
+                  <m:t>=</m:t>
+                </m:r>
+                <m:r>
+                  <m:rPr>
+                    <m:sty m:val="p"/>
+                  </m:rPr>
+                  <m:t>−</m:t>
+                </m:r>
+                <m:d>
+                  <m:dPr>
+                    <m:begChr m:val="("/>
+                    <m:sepChr m:val=""/>
+                    <m:endChr m:val=")"/>
+                    <m:grow/>
+                  </m:dPr>
+                  <m:e>
+                    <m:sSub>
+                      <m:e>
+                        <m:r>
+                          <m:t>η</m:t>
+                        </m:r>
+                      </m:e>
+                      <m:sub>
+                        <m:r>
+                          <m:t>t</m:t>
+                        </m:r>
+                      </m:sub>
+                    </m:sSub>
+                    <m:r>
+                      <m:rPr>
+                        <m:sty m:val="p"/>
+                      </m:rPr>
+                      <m:t>−</m:t>
+                    </m:r>
+                    <m:sSub>
+                      <m:e>
+                        <m:bar>
+                          <m:barPr>
+                            <m:pos m:val="top"/>
+                          </m:barPr>
+                          <m:e>
+                            <m:r>
+                              <m:t>η</m:t>
+                            </m:r>
+                          </m:e>
+                        </m:bar>
+                      </m:e>
+                      <m:sub>
+                        <m:r>
+                          <m:t>t</m:t>
+                        </m:r>
+                        <m:r>
+                          <m:rPr>
+                            <m:sty m:val="p"/>
+                          </m:rPr>
+                          <m:t>,</m:t>
+                        </m:r>
+                        <m:r>
+                          <m:t>K</m:t>
+                        </m:r>
+                      </m:sub>
+                    </m:sSub>
+                  </m:e>
+                </m:d>
+                <m:r>
+                  <m:rPr>
+                    <m:sty m:val="p"/>
+                  </m:rPr>
+                  <m:t>+</m:t>
+                </m:r>
+                <m:d>
+                  <m:dPr>
+                    <m:begChr m:val="("/>
+                    <m:sepChr m:val=""/>
+                    <m:endChr m:val=")"/>
+                    <m:grow/>
+                  </m:dPr>
+                  <m:e>
+                    <m:sSub>
+                      <m:e>
+                        <m:r>
+                          <m:t>d</m:t>
+                        </m:r>
+                      </m:e>
+                      <m:sub>
+                        <m:r>
+                          <m:t>t</m:t>
+                        </m:r>
+                      </m:sub>
+                    </m:sSub>
+                    <m:r>
+                      <m:rPr>
+                        <m:sty m:val="p"/>
+                      </m:rPr>
+                      <m:t>−</m:t>
+                    </m:r>
+                    <m:sSub>
+                      <m:e>
+                        <m:bar>
+                          <m:barPr>
+                            <m:pos m:val="top"/>
+                          </m:barPr>
+                          <m:e>
+                            <m:r>
+                              <m:t>d</m:t>
+                            </m:r>
+                          </m:e>
+                        </m:bar>
+                      </m:e>
+                      <m:sub>
+                        <m:r>
+                          <m:t>t</m:t>
+                        </m:r>
+                        <m:r>
+                          <m:rPr>
+                            <m:sty m:val="p"/>
+                          </m:rPr>
+                          <m:t>,</m:t>
+                        </m:r>
+                        <m:r>
+                          <m:t>K</m:t>
+                        </m:r>
+                      </m:sub>
+                    </m:sSub>
+                  </m:e>
+                </m:d>
+                <m:r>
+                  <m:rPr>
+                    <m:sty m:val="p"/>
+                  </m:rPr>
+                  <m:t>,</m:t>
+                </m:r>
+                <m:r>
+                  <m:t>  </m:t>
+                </m:r>
+                <m:d>
+                  <m:dPr>
+                    <m:begChr m:val="|"/>
+                    <m:sepChr m:val=""/>
+                    <m:endChr m:val="|"/>
+                    <m:grow/>
+                  </m:dPr>
+                  <m:e>
+                    <m:sSub>
+                      <m:e>
+                        <m:r>
+                          <m:t>d</m:t>
+                        </m:r>
+                      </m:e>
+                      <m:sub>
+                        <m:r>
+                          <m:t>t</m:t>
+                        </m:r>
+                      </m:sub>
+                    </m:sSub>
+                    <m:r>
+                      <m:rPr>
+                        <m:sty m:val="p"/>
+                      </m:rPr>
+                      <m:t>−</m:t>
+                    </m:r>
+                    <m:sSub>
+                      <m:e>
+                        <m:bar>
+                          <m:barPr>
+                            <m:pos m:val="top"/>
+                          </m:barPr>
+                          <m:e>
+                            <m:r>
+                              <m:t>d</m:t>
+                            </m:r>
+                          </m:e>
+                        </m:bar>
+                      </m:e>
+                      <m:sub>
+                        <m:r>
+                          <m:t>t</m:t>
+                        </m:r>
+                        <m:r>
+                          <m:rPr>
+                            <m:sty m:val="p"/>
+                          </m:rPr>
+                          <m:t>,</m:t>
+                        </m:r>
+                        <m:r>
+                          <m:t>K</m:t>
+                        </m:r>
+                      </m:sub>
+                    </m:sSub>
+                  </m:e>
+                </m:d>
+                <m:r>
+                  <m:rPr>
+                    <m:sty m:val="p"/>
+                  </m:rPr>
+                  <m:t>≤</m:t>
+                </m:r>
+                <m:r>
+                  <m:t>ρ</m:t>
+                </m:r>
+                <m:r>
+                  <m:t> </m:t>
+                </m:r>
+                <m:f>
+                  <m:fPr>
+                    <m:type m:val="bar"/>
+                  </m:fPr>
+                  <m:num>
+                    <m:r>
+                      <m:t>K</m:t>
+                    </m:r>
+                    <m:r>
+                      <m:rPr>
+                        <m:sty m:val="p"/>
+                      </m:rPr>
+                      <m:t>+</m:t>
+                    </m:r>
+                    <m:r>
+                      <m:t>1</m:t>
+                    </m:r>
+                  </m:num>
+                  <m:den>
+                    <m:r>
+                      <m:t>2</m:t>
+                    </m:r>
+                  </m:den>
+                </m:f>
+              </m:oMath>
+            </m:oMathPara>
+          </w:p>
+        </w:tc>
+        <w:tc>
+          <w:tcPr>
+            <w:tcW w:type="dxa" w:w="780"/>
+            <w:tcBorders>
+              <w:top w:val="none" w:color="FFFFFF" w:sz="0"/>
+              <w:left w:val="none" w:color="FFFFFF" w:sz="0"/>
+              <w:bottom w:val="none" w:color="FFFFFF" w:sz="0"/>
+              <w:right w:val="none" w:color="FFFFFF" w:sz="0"/>
+            </w:tcBorders>
+            <w:tcMar>
+              <w:top w:type="dxa" w:w="20"/>
+              <w:left w:type="dxa" w:w="0"/>
+              <w:bottom w:type="dxa" w:w="20"/>
+              <w:right w:type="dxa" w:w="0"/>
+            </w:tcMar>
+            <w:vAlign w:val="center"/>
+          </w:tcPr>
+          <w:p>
+            <w:pPr>
+              <w:jc w:val="right"/>
+            </w:pPr>
+            <w:r>
+              <w:t xml:space="preserve">(9)</w:t>
+            </w:r>
+          </w:p>
+        </w:tc>
+      </w:tr>
+    </w:tbl>
+    <w:p>
+      <w:pPr>
+        <w:spacing w:after="120" w:before="20"/>
+        <w:ind w:left="284"/>
+        <w:jc w:val="left"/>
+      </w:pPr>
+      <w:r>
+        <w:rPr>
+          <w:i/>
+          <w:iCs/>
+          <w:color w:val="3A4350"/>
+          <w:sz w:val="19"/>
+          <w:szCs w:val="19"/>
+        </w:rPr>
+        <w:t xml:space="preserve">where </w:t>
+      </w:r>
+      <w:r>
+        <w:rPr>
+          <w:color w:val="3A4350"/>
+          <w:sz w:val="19"/>
+          <w:szCs w:val="19"/>
+        </w:rPr>
+        <w:t xml:space="preserve">the bars are means over the </w:t>
+      </w:r>
+      <m:oMath>
+        <m:r>
+          <m:t>K</m:t>
+        </m:r>
+      </m:oMath>
+      <w:r>
+        <w:rPr>
+          <w:color w:val="3A4350"/>
+          <w:sz w:val="19"/>
+          <w:szCs w:val="19"/>
+        </w:rPr>
+        <w:t xml:space="preserve"> samples. The unknown drift is replaced by a lag error bounded by the drift rate times the mean age of the samples. A margin that covers the </w:t>
+      </w:r>
+      <m:oMath>
+        <m:d>
+          <m:dPr>
+            <m:begChr m:val="("/>
+            <m:sepChr m:val=""/>
+            <m:endChr m:val=")"/>
+            <m:grow/>
+          </m:dPr>
+          <m:e>
+            <m:r>
+              <m:t>1</m:t>
+            </m:r>
+            <m:r>
+              <m:rPr>
+                <m:sty m:val="p"/>
+              </m:rPr>
+              <m:t>−</m:t>
+            </m:r>
+            <m:r>
+              <m:t>α</m:t>
+            </m:r>
+          </m:e>
+        </m:d>
+      </m:oMath>
+      <w:r>
+        <w:rPr>
+          <w:color w:val="3A4350"/>
+          <w:sz w:val="19"/>
+          <w:szCs w:val="19"/>
+        </w:rPr>
+        <w:t xml:space="preserve">-quantile of </w:t>
+      </w:r>
+      <m:oMath>
+        <m:r>
+          <m:rPr>
+            <m:sty m:val="p"/>
+          </m:rPr>
+          <m:t>−</m:t>
+        </m:r>
+        <m:d>
+          <m:dPr>
+            <m:begChr m:val="("/>
+            <m:sepChr m:val=""/>
+            <m:endChr m:val=")"/>
+            <m:grow/>
+          </m:dPr>
+          <m:e>
+            <m:sSub>
+              <m:e>
+                <m:r>
+                  <m:t>η</m:t>
+                </m:r>
+              </m:e>
+              <m:sub>
+                <m:r>
+                  <m:t>t</m:t>
+                </m:r>
+              </m:sub>
+            </m:sSub>
+            <m:r>
+              <m:rPr>
+                <m:sty m:val="p"/>
+              </m:rPr>
+              <m:t>−</m:t>
+            </m:r>
+            <m:sSub>
+              <m:e>
+                <m:bar>
+                  <m:barPr>
+                    <m:pos m:val="top"/>
+                  </m:barPr>
+                  <m:e>
+                    <m:r>
+                      <m:t>η</m:t>
+                    </m:r>
+                  </m:e>
+                </m:bar>
+              </m:e>
+              <m:sub>
+                <m:r>
+                  <m:t>t</m:t>
+                </m:r>
+                <m:r>
+                  <m:rPr>
+                    <m:sty m:val="p"/>
+                  </m:rPr>
+                  <m:t>,</m:t>
+                </m:r>
+                <m:r>
+                  <m:t>K</m:t>
+                </m:r>
+              </m:sub>
+            </m:sSub>
+          </m:e>
+        </m:d>
+      </m:oMath>
+      <w:r>
+        <w:rPr>
+          <w:color w:val="3A4350"/>
+          <w:sz w:val="19"/>
+          <w:szCs w:val="19"/>
+        </w:rPr>
+        <w:t xml:space="preserve"> plus </w:t>
+      </w:r>
+      <m:oMath>
+        <m:r>
+          <m:t>ρ</m:t>
+        </m:r>
+        <m:d>
+          <m:dPr>
+            <m:begChr m:val="("/>
+            <m:sepChr m:val=""/>
+            <m:endChr m:val=")"/>
+            <m:grow/>
+          </m:dPr>
+          <m:e>
+            <m:r>
+              <m:t>K</m:t>
+            </m:r>
+            <m:r>
+              <m:rPr>
+                <m:sty m:val="p"/>
+              </m:rPr>
+              <m:t>+</m:t>
+            </m:r>
+            <m:r>
+              <m:t>1</m:t>
+            </m:r>
+          </m:e>
+        </m:d>
+        <m:r>
+          <m:rPr>
+            <m:sty m:val="p"/>
+          </m:rPr>
+          <m:t>/</m:t>
+        </m:r>
+        <m:r>
+          <m:t>2</m:t>
+        </m:r>
+      </m:oMath>
+      <w:r>
+        <w:rPr>
+          <w:color w:val="3A4350"/>
+          <w:sz w:val="19"/>
+          <w:szCs w:val="19"/>
+        </w:rPr>
+        <w:t xml:space="preserve"> certifies the re-anchored alarm.</w:t>
+      </w:r>
+    </w:p>
+    <w:p>
+      <w:pPr>
+        <w:spacing w:after="110"/>
+        <w:jc w:val="both"/>
+      </w:pPr>
+      <w:r>
+        <w:rPr>
+          <w:i/>
+          <w:iCs/>
+        </w:rPr>
+        <w:t xml:space="preserve">Proof. </w:t>
+      </w:r>
+      <w:r>
+        <w:t xml:space="preserve">Write </w:t>
+      </w:r>
+      <m:oMath>
+        <m:sSub>
+          <m:e>
+            <m:bar>
+              <m:barPr>
+                <m:pos m:val="top"/>
+              </m:barPr>
+              <m:e>
+                <m:r>
+                  <m:t>e</m:t>
+                </m:r>
+              </m:e>
+            </m:bar>
+          </m:e>
+          <m:sub>
+            <m:r>
+              <m:t>t</m:t>
+            </m:r>
+            <m:r>
+              <m:rPr>
+                <m:sty m:val="p"/>
+              </m:rPr>
+              <m:t>,</m:t>
+            </m:r>
+            <m:r>
+              <m:t>K</m:t>
+            </m:r>
+          </m:sub>
+        </m:sSub>
+        <m:r>
+          <m:rPr>
+            <m:sty m:val="p"/>
+          </m:rPr>
+          <m:t>=</m:t>
+        </m:r>
+        <m:f>
+          <m:fPr>
+            <m:type m:val="bar"/>
+          </m:fPr>
+          <m:num>
+            <m:r>
+              <m:t>1</m:t>
+            </m:r>
+          </m:num>
+          <m:den>
+            <m:r>
+              <m:t>K</m:t>
+            </m:r>
+          </m:den>
+        </m:f>
+        <m:nary>
+          <m:naryPr>
+            <m:chr m:val="∑"/>
+            <m:limLoc m:val="undOvr"/>
+            <m:subHide m:val="off"/>
+            <m:supHide m:val="off"/>
+          </m:naryPr>
+          <m:sub>
+            <m:r>
+              <m:t>k</m:t>
+            </m:r>
+            <m:r>
+              <m:rPr>
+                <m:sty m:val="p"/>
+              </m:rPr>
+              <m:t>=</m:t>
+            </m:r>
+            <m:r>
+              <m:t>1</m:t>
+            </m:r>
+          </m:sub>
+          <m:sup>
+            <m:r>
+              <m:t>K</m:t>
+            </m:r>
+          </m:sup>
+          <m:e>
+            <m:d>
+              <m:dPr>
+                <m:begChr m:val="("/>
+                <m:sepChr m:val=""/>
+                <m:endChr m:val=")"/>
+                <m:grow/>
+              </m:dPr>
+              <m:e>
+                <m:sSub>
+                  <m:e>
+                    <m:acc>
+                      <m:accPr>
+                        <m:chr m:val="̂"/>
+                      </m:accPr>
+                      <m:e>
+                        <m:r>
+                          <m:t>Y</m:t>
+                        </m:r>
+                      </m:e>
+                    </m:acc>
+                  </m:e>
+                  <m:sub>
+                    <m:r>
+                      <m:t>t</m:t>
+                    </m:r>
+                    <m:r>
+                      <m:rPr>
+                        <m:sty m:val="p"/>
+                      </m:rPr>
+                      <m:t>−</m:t>
+                    </m:r>
+                    <m:r>
+                      <m:t>k</m:t>
+                    </m:r>
+                  </m:sub>
+                </m:sSub>
+                <m:r>
+                  <m:rPr>
+                    <m:sty m:val="p"/>
+                  </m:rPr>
+                  <m:t>−</m:t>
+                </m:r>
+                <m:sSub>
+                  <m:e>
+                    <m:r>
+                      <m:t>Y</m:t>
+                    </m:r>
+                  </m:e>
+                  <m:sub>
+                    <m:r>
+                      <m:t>t</m:t>
+                    </m:r>
+                    <m:r>
+                      <m:rPr>
+                        <m:sty m:val="p"/>
+                      </m:rPr>
+                      <m:t>−</m:t>
+                    </m:r>
+                    <m:r>
+                      <m:t>k</m:t>
+                    </m:r>
+                  </m:sub>
+                </m:sSub>
+              </m:e>
+            </m:d>
+          </m:e>
+        </m:nary>
+        <m:r>
+          <m:rPr>
+            <m:sty m:val="p"/>
+          </m:rPr>
+          <m:t>=</m:t>
+        </m:r>
+        <m:r>
+          <m:rPr>
+            <m:sty m:val="p"/>
+          </m:rPr>
+          <m:t>−</m:t>
+        </m:r>
+        <m:sSub>
+          <m:e>
+            <m:bar>
+              <m:barPr>
+                <m:pos m:val="top"/>
+              </m:barPr>
+              <m:e>
+                <m:r>
+                  <m:t>η</m:t>
+                </m:r>
+              </m:e>
+            </m:bar>
+          </m:e>
+          <m:sub>
+            <m:r>
+              <m:t>t</m:t>
+            </m:r>
+            <m:r>
+              <m:rPr>
+                <m:sty m:val="p"/>
+              </m:rPr>
+              <m:t>,</m:t>
+            </m:r>
+            <m:r>
+              <m:t>K</m:t>
+            </m:r>
+          </m:sub>
+        </m:sSub>
+        <m:r>
+          <m:rPr>
+            <m:sty m:val="p"/>
+          </m:rPr>
+          <m:t>+</m:t>
+        </m:r>
+        <m:sSub>
+          <m:e>
+            <m:bar>
+              <m:barPr>
+                <m:pos m:val="top"/>
+              </m:barPr>
+              <m:e>
+                <m:r>
+                  <m:t>d</m:t>
+                </m:r>
+              </m:e>
+            </m:bar>
+          </m:e>
+          <m:sub>
+            <m:r>
+              <m:t>t</m:t>
+            </m:r>
+            <m:r>
+              <m:rPr>
+                <m:sty m:val="p"/>
+              </m:rPr>
+              <m:t>,</m:t>
+            </m:r>
+            <m:r>
+              <m:t>K</m:t>
+            </m:r>
+          </m:sub>
+        </m:sSub>
+      </m:oMath>
+      <w:r>
+        <w:t xml:space="preserve"> and subtract. For the bound, </w:t>
+      </w:r>
+      <m:oMath>
+        <m:d>
+          <m:dPr>
+            <m:begChr m:val="|"/>
+            <m:sepChr m:val=""/>
+            <m:endChr m:val="|"/>
+            <m:grow/>
+          </m:dPr>
+          <m:e>
+            <m:sSub>
+              <m:e>
+                <m:r>
+                  <m:t>d</m:t>
+                </m:r>
+              </m:e>
+              <m:sub>
+                <m:r>
+                  <m:t>t</m:t>
+                </m:r>
+              </m:sub>
+            </m:sSub>
+            <m:r>
+              <m:rPr>
+                <m:sty m:val="p"/>
+              </m:rPr>
+              <m:t>−</m:t>
+            </m:r>
+            <m:sSub>
+              <m:e>
+                <m:r>
+                  <m:t>d</m:t>
+                </m:r>
+              </m:e>
+              <m:sub>
+                <m:r>
+                  <m:t>t</m:t>
+                </m:r>
+                <m:r>
+                  <m:rPr>
+                    <m:sty m:val="p"/>
+                  </m:rPr>
+                  <m:t>−</m:t>
+                </m:r>
+                <m:r>
+                  <m:t>k</m:t>
+                </m:r>
+              </m:sub>
+            </m:sSub>
+          </m:e>
+        </m:d>
+        <m:r>
+          <m:rPr>
+            <m:sty m:val="p"/>
+          </m:rPr>
+          <m:t>≤</m:t>
+        </m:r>
+        <m:r>
+          <m:t>ρ</m:t>
+        </m:r>
+        <m:r>
+          <m:t>k</m:t>
+        </m:r>
+      </m:oMath>
+      <w:r>
+        <w:t xml:space="preserve">, and the mean of </w:t>
+      </w:r>
+      <m:oMath>
+        <m:r>
+          <m:t>k</m:t>
+        </m:r>
+        <m:r>
+          <m:rPr>
+            <m:sty m:val="p"/>
+          </m:rPr>
+          <m:t>=</m:t>
+        </m:r>
+        <m:r>
+          <m:t>1</m:t>
+        </m:r>
+        <m:r>
+          <m:rPr>
+            <m:sty m:val="p"/>
+          </m:rPr>
+          <m:t>,</m:t>
+        </m:r>
+        <m:r>
+          <m:rPr>
+            <m:sty m:val="p"/>
+          </m:rPr>
+          <m:t>…</m:t>
+        </m:r>
+        <m:r>
+          <m:rPr>
+            <m:sty m:val="p"/>
+          </m:rPr>
+          <m:t>,</m:t>
+        </m:r>
+        <m:r>
+          <m:t>K</m:t>
+        </m:r>
+      </m:oMath>
+      <w:r>
+        <w:t xml:space="preserve"> is </w:t>
+      </w:r>
+      <m:oMath>
+        <m:d>
+          <m:dPr>
+            <m:begChr m:val="("/>
+            <m:sepChr m:val=""/>
+            <m:endChr m:val=")"/>
+            <m:grow/>
+          </m:dPr>
+          <m:e>
+            <m:r>
+              <m:t>K</m:t>
+            </m:r>
+            <m:r>
+              <m:rPr>
+                <m:sty m:val="p"/>
+              </m:rPr>
+              <m:t>+</m:t>
+            </m:r>
+            <m:r>
+              <m:t>1</m:t>
+            </m:r>
+          </m:e>
+        </m:d>
+        <m:r>
+          <m:rPr>
+            <m:sty m:val="p"/>
+          </m:rPr>
+          <m:t>/</m:t>
+        </m:r>
+        <m:r>
+          <m:t>2</m:t>
+        </m:r>
+      </m:oMath>
+      <w:r>
+        <w:t xml:space="preserve">.</w:t>
+      </w:r>
+      <w:r>
+        <w:t xml:space="preserve"> □</w:t>
+      </w:r>
+    </w:p>
+    <w:p>
+      <w:pPr>
+        <w:spacing w:after="100"/>
+        <w:jc w:val="both"/>
+      </w:pPr>
+      <w:r>
+        <w:t xml:space="preserve">With independent seasons the noise term has 1.15 times the spread of </w:t>
+      </w:r>
+      <m:oMath>
+        <m:sSub>
+          <m:e>
+            <m:r>
+              <m:t>η</m:t>
+            </m:r>
+          </m:e>
+          <m:sub>
+            <m:r>
+              <m:t>t</m:t>
+            </m:r>
+          </m:sub>
+        </m:sSub>
+      </m:oMath>
+      <w:r>
+        <w:t xml:space="preserve"> for </w:t>
+      </w:r>
+      <m:oMath>
+        <m:r>
+          <m:t>K</m:t>
+        </m:r>
+        <m:r>
+          <m:rPr>
+            <m:sty m:val="p"/>
+          </m:rPr>
+          <m:t>=</m:t>
+        </m:r>
+        <m:r>
+          <m:t>3</m:t>
+        </m:r>
+      </m:oMath>
+      <w:r>
+        <w:t xml:space="preserve">. The test kept the margin of the static alarm and added nothing for the drift, so it checks whether the drift term is small in practice. It is. The re-anchored SPIRANCA-GO alarm over-predicts in 3.4%, 3.1% and 3.1% of the seasons in the three scenarios. It exceeds 10% in 1 aquifer of 20 and misses 1.1% of the exceedances, against 24.2% for the static alarm. Its false alarms (54% of the safe seasons) are many, because after the decision most safe seasons lie close to the standard, but they are 25 points fewer than those of the bolted-on certificate.</w:t>
+      </w:r>
+    </w:p>
+    <w:p>
+      <w:pPr>
+        <w:spacing w:after="100"/>
+        <w:jc w:val="both"/>
+      </w:pPr>
+      <w:r>
+        <w:t xml:space="preserve">Re-anchoring alone is not enough. Least squares on heads and anchors, re-anchored the same way, still over-predicts in 24.7% of the seasons (9 aquifers above 10%). Its margin was calibrated for a world without unrecorded shifts, and between two samples nothing covers the warming or the season-to-season error the decision adds. Each part does one job. The certificate of Theorem S2 covers what can move unseen within the span of the record. The yearly sample covers what the decision does outside it.</w:t>
+      </w:r>
+    </w:p>
+    <w:p>
+      <w:pPr>
+        <w:spacing w:after="100"/>
+        <w:jc w:val="both"/>
+      </w:pPr>
+      <w:r>
+        <w:t xml:space="preserve">The choice of piezometers matters less once the alarm is re-anchored. With three wells, the static alarm on the three wells nearest the supply well failed in 11 aquifers (35.1%), the design of largest record </w:t>
+      </w:r>
+      <m:oMath>
+        <m:sSup>
+          <m:e>
+            <m:r>
+              <m:t>R</m:t>
+            </m:r>
+          </m:e>
+          <m:sup>
+            <m:r>
+              <m:t>2</m:t>
+            </m:r>
+          </m:sup>
+        </m:sSup>
+      </m:oMath>
+      <w:r>
+        <w:t xml:space="preserve"> in 8 and the SPIRANCA-GO design in 9. Re-anchored, they fail in 3, 1 and 1 (4.5%, 3.1% and 3.1%).</w:t>
+      </w:r>
+    </w:p>
+    <w:p>
+      <w:pPr>
+        <w:keepNext/>
+        <w:spacing w:after="40" w:before="120"/>
+        <w:jc w:val="center"/>
+      </w:pPr>
+      <w:r>
+        <w:drawing>
+          <wp:inline distT="0" distB="0" distL="0" distR="0">
+            <wp:extent cx="6124575" cy="2695575"/>
+            <wp:effectExtent t="0" r="0" b="0" l="0"/>
+            <wp:docPr id="1" name="Alarm validity on the variable-density section; one aquifer after the decision" descr="Alarm validity on the variable-density section; one aquifer after the decision" title="Alarm validity on the variable-density section; one aquifer after the decision"/>
+            <wp:cNvGraphicFramePr>
+              <a:graphicFrameLocks xmlns:a="http://schemas.openxmlformats.org/drawingml/2006/main" noChangeAspect="1"/>
+            </wp:cNvGraphicFramePr>
+            <a:graphic xmlns:a="http://schemas.openxmlformats.org/drawingml/2006/main">
+              <a:graphicData uri="http://schemas.openxmlformats.org/drawingml/2006/picture">
+                <pic:pic xmlns:pic="http://schemas.openxmlformats.org/drawingml/2006/picture">
+                  <pic:nvPicPr>
+                    <pic:cNvPr id="0" name="" descr=""/>
+                    <pic:cNvPicPr>
+                      <a:picLocks noChangeAspect="1" noChangeArrowheads="1"/>
+                    </pic:cNvPicPr>
+                  </pic:nvPicPr>
+                  <pic:blipFill>
+                    <a:blip r:embed="rId14" cstate="none"/>
+                    <a:srcRect/>
+                    <a:stretch>
+                      <a:fillRect/>
+                    </a:stretch>
+                  </pic:blipFill>
+                  <pic:spPr bwMode="auto">
+                    <a:xfrm>
+                      <a:off x="0" y="0"/>
+                      <a:ext cx="6124575" cy="2695575"/>
+                    </a:xfrm>
+                    <a:prstGeom prst="rect">
+                      <a:avLst/>
+                    </a:prstGeom>
+                  </pic:spPr>
+                </pic:pic>
+              </a:graphicData>
+            </a:graphic>
+          </wp:inline>
+        </w:drawing>
+      </w:r>
+    </w:p>
+    <w:p>
+      <w:pPr>
+        <w:spacing w:after="180"/>
+        <w:jc w:val="both"/>
+      </w:pPr>
+      <w:r>
+        <w:rPr>
+          <w:b/>
+          <w:bCs/>
+          <w:color w:val="1F3864"/>
+          <w:sz w:val="18"/>
+          <w:szCs w:val="18"/>
+        </w:rPr>
+        <w:t xml:space="preserve">Figure 4. </w:t>
+      </w:r>
+      <w:r>
+        <w:rPr>
+          <w:color w:val="3A4350"/>
+          <w:sz w:val="18"/>
+          <w:szCs w:val="18"/>
+        </w:rPr>
+        <w:t xml:space="preserve">(a) Share of future seasons in which each alarm over-predicts by more than its margin on the variable-density section (dot: mean over 20 aquifers; line: 10–90% range); shaded: the two alarms re-anchored by a yearly chloride sample at the supply screen. (b) One aquifer where the static alarm fails: chloride at the supply screen after the decision (black), the static SPIRANCA-GO prediction from the heads (red), which sees the change only for five years, and the same prediction re-anchored by a yearly sample (blue); dotted: the predicted chloride above which the alarm sounds.</w:t>
+      </w:r>
+    </w:p>
+    <w:p>
+      <w:pPr>
+        <w:pStyle w:val="Heading2"/>
+      </w:pPr>
+      <w:r>
+        <w:t xml:space="preserve">7.3 What the section adds</w:t>
+      </w:r>
+    </w:p>
+    <w:p>
+      <w:pPr>
+        <w:spacing w:after="100"/>
+        <w:jc w:val="both"/>
+      </w:pPr>
+      <w:r>
+        <w:t xml:space="preserve">The section confirms two parts of SPIRANCA-GO and corrects a third. The unrecorded warming is certified as the theory says, now in a model with memory and nonlinear heads, provided that the anchors carry their history (filters over 2, 8 and 20 years). A static alarm built before the decision can fail after it, when the decision moves the screen into a regime the record did not contain. This happens exactly where an alarm matters most, at screens that are still fresh. The repair is cheap: one chloride sample a year at the supply screen, used to re-anchor the alarm. This is what Proposition S5 says and what the test shows. At Fushë-Kuqe, where chloride has been measured at a few wells in a few years, this is the measurement to add first after any change of pumping.</w:t>
+      </w:r>
+    </w:p>
+    <w:p>
+      <w:pPr>
+        <w:pStyle w:val="Heading1"/>
+      </w:pPr>
+      <w:r>
+        <w:t xml:space="preserve">8. What to do next</w:t>
       </w:r>
     </w:p>
     <w:p>
@@ -16651,10 +20038,31 @@
           <w:b/>
           <w:bCs/>
         </w:rPr>
-        <w:t xml:space="preserve">Next test.</w:t>
-      </w:r>
-      <w:r>
-        <w:t xml:space="preserve"> Repeat Section 6 on the variable-density section of the assembled-system note with lagged anchors, where the interface has memory and heads are nonlinear in the potential.</w:t>
+        <w:t xml:space="preserve">After any change of pumping.</w:t>
+      </w:r>
+      <w:r>
+        <w:t xml:space="preserve"> Sample chloride at each supply screen at least once a year and re-anchor the head-based alarm with the samples (Proposition S5). On the variable-density section this was what kept the alarm valid where the decision moved the screen out of the regime of the record (Section 7).</w:t>
+      </w:r>
+    </w:p>
+    <w:p>
+      <w:pPr>
+        <w:pStyle w:val="ListParagraph"/>
+        <w:numPr>
+          <w:ilvl w:val="0"/>
+          <w:numId w:val="2"/>
+        </w:numPr>
+        <w:spacing w:after="50"/>
+        <w:jc w:val="both"/>
+      </w:pPr>
+      <w:r>
+        <w:rPr>
+          <w:b/>
+          <w:bCs/>
+        </w:rPr>
+        <w:t xml:space="preserve">Next step.</w:t>
+      </w:r>
+      <w:r>
+        <w:t xml:space="preserve"> Repeat Section 7 on the three-dimensional Fushë-Kuqe sector, with the present state from the assimilation of the chloride series of 1984–2001 and the anchors from the real pumping and rainfall records.</w:t>
       </w:r>
     </w:p>
     <w:p>
@@ -16663,7 +20071,7 @@
         <w:jc w:val="both"/>
       </w:pPr>
       <w:r>
-        <w:t xml:space="preserve">Prepared on 27 October 2026 from the two uploaded documents and from experiments/spiranca_go in the author's repository (sg_model.py, sg_run.py, sg_checks.py, sg_ltt.py, sg_figs.py); every number about the tests is read from experiments/spiranca_go/res and checked when the document is built. The twenty papers are cited with the details of the twenty-paper note, which checked them; they were not re-checked here. The propositions S1–S4 are ours; they were not found in the papers read, but the search was not systematic.</w:t>
+        <w:t xml:space="preserve">Prepared on 27 October 2026 from the two uploaded documents and from experiments/spiranca_go in the author's repository (sg_model.py, sg_run.py, sg_checks.py, sg_ltt.py, sg_figs.py, and for Section 7 sv_model.py and sv_run.py); every number about the tests is read from experiments/spiranca_go/res and checked when the document is built. The twenty papers are cited with the details of the twenty-paper note, which checked them; they were not re-checked here. The propositions S1–S5 are ours; they were not found in the papers read, but the search was not systematic.</w:t>
       </w:r>
     </w:p>
     <w:p>
@@ -16748,7 +20156,7 @@
         </w:rPr>
         <w:t xml:space="preserve"> </w:t>
       </w:r>
-      <w:hyperlink w:history="1" r:id="rId7qasxbtdo2amu7zu3ju5y">
+      <w:hyperlink w:history="1" r:id="rIdo6gwnvwj_zjdcsejk7n3v">
         <w:r>
           <w:rPr>
             <w:color w:val="1D4ED8"/>
@@ -16892,7 +20300,7 @@
         </w:rPr>
         <w:t xml:space="preserve"> </w:t>
       </w:r>
-      <w:hyperlink w:history="1" r:id="rId5tqr0ec60p_35gcgvvesw">
+      <w:hyperlink w:history="1" r:id="rIda393npekxx5f-qcetjcqd">
         <w:r>
           <w:rPr>
             <w:color w:val="1D4ED8"/>
@@ -16952,7 +20360,7 @@
         </w:rPr>
         <w:t xml:space="preserve"> </w:t>
       </w:r>
-      <w:hyperlink w:history="1" r:id="rIdw178tkp1hl2qjjyxd8zxm">
+      <w:hyperlink w:history="1" r:id="rIdp-wcbpp-smrhziwub2w64">
         <w:r>
           <w:rPr>
             <w:color w:val="1D4ED8"/>
@@ -17012,7 +20420,7 @@
         </w:rPr>
         <w:t xml:space="preserve"> </w:t>
       </w:r>
-      <w:hyperlink w:history="1" r:id="rIdc8clbshexife77lewsxem">
+      <w:hyperlink w:history="1" r:id="rId51vszin3xrfjp-okmvaap">
         <w:r>
           <w:rPr>
             <w:color w:val="1D4ED8"/>
@@ -17072,7 +20480,7 @@
         </w:rPr>
         <w:t xml:space="preserve"> </w:t>
       </w:r>
-      <w:hyperlink w:history="1" r:id="rIdzogjnun-r-4gfrpgs_ng2">
+      <w:hyperlink w:history="1" r:id="rId9xb25rcirdxjd6yjqryea">
         <w:r>
           <w:rPr>
             <w:color w:val="1D4ED8"/>
@@ -17132,7 +20540,7 @@
         </w:rPr>
         <w:t xml:space="preserve"> </w:t>
       </w:r>
-      <w:hyperlink w:history="1" r:id="rId6pt7carnpjfa0rolnotsb">
+      <w:hyperlink w:history="1" r:id="rIdomwo-b-_5uupelcnazmi5">
         <w:r>
           <w:rPr>
             <w:color w:val="1D4ED8"/>
@@ -17192,7 +20600,7 @@
         </w:rPr>
         <w:t xml:space="preserve"> </w:t>
       </w:r>
-      <w:hyperlink w:history="1" r:id="rId3nnsekytckoazkbmaj0j4">
+      <w:hyperlink w:history="1" r:id="rIdvhdjgkwdrxtd1hs_1l8pg">
         <w:r>
           <w:rPr>
             <w:color w:val="1D4ED8"/>
@@ -17252,7 +20660,7 @@
         </w:rPr>
         <w:t xml:space="preserve"> </w:t>
       </w:r>
-      <w:hyperlink w:history="1" r:id="rIdoochothsaasc2lefl8v4h">
+      <w:hyperlink w:history="1" r:id="rIdqbo7qtdoinxigrtan3w1s">
         <w:r>
           <w:rPr>
             <w:color w:val="1D4ED8"/>
@@ -17312,7 +20720,7 @@
         </w:rPr>
         <w:t xml:space="preserve"> </w:t>
       </w:r>
-      <w:hyperlink w:history="1" r:id="rIdnrfvw2wbv53qf3wzh7use">
+      <w:hyperlink w:history="1" r:id="rIdycvph3itogmnmrg7pxeia">
         <w:r>
           <w:rPr>
             <w:color w:val="1D4ED8"/>
@@ -17372,7 +20780,7 @@
         </w:rPr>
         <w:t xml:space="preserve"> </w:t>
       </w:r>
-      <w:hyperlink w:history="1" r:id="rIdrahm5tthqr4lco8afocie">
+      <w:hyperlink w:history="1" r:id="rId09mkuq21g845nfhrncbm5">
         <w:r>
           <w:rPr>
             <w:color w:val="1D4ED8"/>
@@ -17432,7 +20840,7 @@
         </w:rPr>
         <w:t xml:space="preserve"> </w:t>
       </w:r>
-      <w:hyperlink w:history="1" r:id="rIdd8x5piofpcnev1vav3ivs">
+      <w:hyperlink w:history="1" r:id="rIdsg3m68d5wjgczicxfeid4">
         <w:r>
           <w:rPr>
             <w:color w:val="1D4ED8"/>
@@ -17534,7 +20942,7 @@
         </w:rPr>
         <w:t xml:space="preserve"> </w:t>
       </w:r>
-      <w:hyperlink w:history="1" r:id="rIdjo9kbvvwfcbwb85hzvafd">
+      <w:hyperlink w:history="1" r:id="rIdpvbkosha2pjomrkehvu3a">
         <w:r>
           <w:rPr>
             <w:color w:val="1D4ED8"/>
@@ -17594,7 +21002,7 @@
         </w:rPr>
         <w:t xml:space="preserve"> </w:t>
       </w:r>
-      <w:hyperlink w:history="1" r:id="rIdq7v8ruh_rlmarybi_yuet">
+      <w:hyperlink w:history="1" r:id="rIdzexas7zcxdymu4_rn5ohg">
         <w:r>
           <w:rPr>
             <w:color w:val="1D4ED8"/>
@@ -17654,7 +21062,7 @@
         </w:rPr>
         <w:t xml:space="preserve"> </w:t>
       </w:r>
-      <w:hyperlink w:history="1" r:id="rIddhgtan5j1c2vyhy9tpbje">
+      <w:hyperlink w:history="1" r:id="rIdyyozredwce_ckdn-epats">
         <w:r>
           <w:rPr>
             <w:color w:val="1D4ED8"/>
@@ -17714,7 +21122,7 @@
         </w:rPr>
         <w:t xml:space="preserve"> </w:t>
       </w:r>
-      <w:hyperlink w:history="1" r:id="rIdiut7f-gsjoyjtahynstfd">
+      <w:hyperlink w:history="1" r:id="rIduq5pswkixinlb9v9d6crm">
         <w:r>
           <w:rPr>
             <w:color w:val="1D4ED8"/>
@@ -17774,7 +21182,7 @@
         </w:rPr>
         <w:t xml:space="preserve"> </w:t>
       </w:r>
-      <w:hyperlink w:history="1" r:id="rIdrpwcg0k2mey9tkjbnp647">
+      <w:hyperlink w:history="1" r:id="rIdy0mukq5-wepiomi5b7zxn">
         <w:r>
           <w:rPr>
             <w:color w:val="1D4ED8"/>
@@ -17834,7 +21242,7 @@
         </w:rPr>
         <w:t xml:space="preserve"> </w:t>
       </w:r>
-      <w:hyperlink w:history="1" r:id="rIdby7ir6klvcq9eiohk4d-j">
+      <w:hyperlink w:history="1" r:id="rId2tjkqvc0jsgkz4civdogg">
         <w:r>
           <w:rPr>
             <w:color w:val="1D4ED8"/>
@@ -17894,7 +21302,7 @@
         </w:rPr>
         <w:t xml:space="preserve"> </w:t>
       </w:r>
-      <w:hyperlink w:history="1" r:id="rIdttqzotvast1xnranou43_">
+      <w:hyperlink w:history="1" r:id="rId1dv5smiwbmyfy6g87yng3">
         <w:r>
           <w:rPr>
             <w:color w:val="1D4ED8"/>
@@ -17954,7 +21362,7 @@
         </w:rPr>
         <w:t xml:space="preserve"> </w:t>
       </w:r>
-      <w:hyperlink w:history="1" r:id="rIdov9nkyr82jownacepikw_">
+      <w:hyperlink w:history="1" r:id="rIdifjpsbxbxfbdj1ucgzm_f">
         <w:r>
           <w:rPr>
             <w:color w:val="1D4ED8"/>
@@ -18014,7 +21422,7 @@
         </w:rPr>
         <w:t xml:space="preserve"> </w:t>
       </w:r>
-      <w:hyperlink w:history="1" r:id="rIde5jibwhw-tnkf1zma0hn2">
+      <w:hyperlink w:history="1" r:id="rIdltzuivfv59bhqsm3qehzh">
         <w:r>
           <w:rPr>
             <w:color w:val="1D4ED8"/>
@@ -18158,7 +21566,7 @@
         </w:rPr>
         <w:t xml:space="preserve"> </w:t>
       </w:r>
-      <w:hyperlink w:history="1" r:id="rId2suo3av7ius6mfoho8lxr">
+      <w:hyperlink w:history="1" r:id="rIdii0azpms-xi9892gpwmtr">
         <w:r>
           <w:rPr>
             <w:color w:val="1D4ED8"/>

</xml_diff>